<commit_message>
Remove dados de exemplo do modelo Word e adiciona referência de placeholders.
Substitui nomes, CPFs, datas e valores fixos por variáveis Jinja, reescreve o build do template com ElementTree e inclui página /referencia para documentar campos e opções.

Co-authored-by: Cursor <cursoragent@cursor.com>
</commit_message>
<xml_diff>
--- a/app/templates_docx/contrato_modelo.docx
+++ b/app/templates_docx/contrato_modelo.docx
@@ -1,8 +1,8 @@
 
 <file path=word/document.xml><?xml version="1.0" encoding="utf-8"?>
-<w:document xmlns:wpc="http://schemas.microsoft.com/office/word/2010/wordprocessingCanvas" xmlns:cx="http://schemas.microsoft.com/office/drawing/2014/chartex" xmlns:cx1="http://schemas.microsoft.com/office/drawing/2015/9/8/chartex" xmlns:cx2="http://schemas.microsoft.com/office/drawing/2015/10/21/chartex" xmlns:cx3="http://schemas.microsoft.com/office/drawing/2016/5/9/chartex" xmlns:cx4="http://schemas.microsoft.com/office/drawing/2016/5/10/chartex" xmlns:cx5="http://schemas.microsoft.com/office/drawing/2016/5/11/chartex" xmlns:cx6="http://schemas.microsoft.com/office/drawing/2016/5/12/chartex" xmlns:cx7="http://schemas.microsoft.com/office/drawing/2016/5/13/chartex" xmlns:cx8="http://schemas.microsoft.com/office/drawing/2016/5/14/chartex" xmlns:mc="http://schemas.openxmlformats.org/markup-compatibility/2006" xmlns:aink="http://schemas.microsoft.com/office/drawing/2016/ink" xmlns:am3d="http://schemas.microsoft.com/office/drawing/2017/model3d" xmlns:o="urn:schemas-microsoft-com:office:office" xmlns:oel="http://schemas.microsoft.com/office/2019/extlst" xmlns:r="http://schemas.openxmlformats.org/officeDocument/2006/relationships" xmlns:m="http://schemas.openxmlformats.org/officeDocument/2006/math" xmlns:v="urn:schemas-microsoft-com:vml" xmlns:wp14="http://schemas.microsoft.com/office/word/2010/wordprocessingDrawing" xmlns:wp="http://schemas.openxmlformats.org/drawingml/2006/wordprocessingDrawing" xmlns:w10="urn:schemas-microsoft-com:office:word" xmlns:w="http://schemas.openxmlformats.org/wordprocessingml/2006/main" xmlns:w14="http://schemas.microsoft.com/office/word/2010/wordml" xmlns:w15="http://schemas.microsoft.com/office/word/2012/wordml" xmlns:w16cex="http://schemas.microsoft.com/office/word/2018/wordml/cex" xmlns:w16cid="http://schemas.microsoft.com/office/word/2016/wordml/cid" xmlns:w16="http://schemas.microsoft.com/office/word/2018/wordml" xmlns:w16du="http://schemas.microsoft.com/office/word/2023/wordml/word16du" xmlns:w16sdtdh="http://schemas.microsoft.com/office/word/2020/wordml/sdtdatahash" xmlns:w16sdtfl="http://schemas.microsoft.com/office/word/2024/wordml/sdtformatlock" xmlns:w16se="http://schemas.microsoft.com/office/word/2015/wordml/symex" xmlns:wpg="http://schemas.microsoft.com/office/word/2010/wordprocessingGroup" xmlns:wpi="http://schemas.microsoft.com/office/word/2010/wordprocessingInk" xmlns:wne="http://schemas.microsoft.com/office/word/2006/wordml" xmlns:wps="http://schemas.microsoft.com/office/word/2010/wordprocessingShape" mc:Ignorable="w14 w15 w16se w16cid w16 w16cex w16sdtdh w16sdtfl w16du wp14">
+<w:document xmlns:ns1="http://schemas.openxmlformats.org/markup-compatibility/2006" xmlns:ns2="http://schemas.microsoft.com/office/word/2010/wordml" xmlns:w="http://schemas.openxmlformats.org/wordprocessingml/2006/main" ns1:Ignorable="w14 w15 w16se w16cid w16 w16cex w16sdtdh w16sdtfl w16du wp14">
   <w:body>
-    <w:p>
+    <w:p ns2:paraId="71CA647B" ns2:textId="77777777">
       <w:pPr>
         <w:spacing w:after="160"/>
         <w:jc w:val="center"/>
@@ -22,7 +22,7 @@
         <w:t>VALORE</w:t>
       </w:r>
     </w:p>
-    <w:p>
+    <w:p ns2:paraId="7C7DAE81" ns2:textId="77777777">
       <w:pPr>
         <w:spacing w:after="600"/>
         <w:jc w:val="center"/>
@@ -40,7 +40,7 @@
         <w:t>Consultores Associados</w:t>
       </w:r>
     </w:p>
-    <w:p>
+    <w:p ns2:paraId="7C9C7363" ns2:textId="77777777">
       <w:pPr>
         <w:pBdr>
           <w:bottom w:val="single" w:sz="8" w:space="6" w:color="E06020"/>
@@ -63,7 +63,7 @@
         <w:t>Contrato de Assessoria Contábil</w:t>
       </w:r>
     </w:p>
-    <w:p>
+    <w:p ns2:paraId="190385CB" ns2:textId="77777777">
       <w:pPr>
         <w:spacing w:before="120" w:after="600"/>
         <w:jc w:val="center"/>
@@ -81,7 +81,7 @@
         <w:t>CPSA-VCA-2026</w:t>
       </w:r>
     </w:p>
-    <w:p>
+    <w:p ns2:paraId="373074B8" ns2:textId="77777777">
       <w:pPr>
         <w:spacing w:before="200" w:after="120"/>
         <w:rPr>
@@ -111,7 +111,7 @@
         <w:t xml:space="preserve">  RESUMO PARA O CLIENTE</w:t>
       </w:r>
     </w:p>
-    <w:p>
+    <w:p ns2:paraId="58FA849E" ns2:textId="77777777">
       <w:pPr>
         <w:spacing w:after="140"/>
         <w:rPr>
@@ -149,7 +149,7 @@
         <w:gridCol w:w="2800"/>
         <w:gridCol w:w="6160"/>
       </w:tblGrid>
-      <w:tr>
+      <w:tr ns2:paraId="35595660" ns2:textId="77777777">
         <w:tc>
           <w:tcPr>
             <w:tcW w:w="2800" w:type="dxa"/>
@@ -167,7 +167,7 @@
               <w:right w:w="160" w:type="dxa"/>
             </w:tcMar>
           </w:tcPr>
-          <w:p>
+          <w:p ns2:paraId="1DBE9012" ns2:textId="77777777">
             <w:pPr>
               <w:rPr>
                 <w:rFonts w:asciiTheme="minorHAnsi" w:hAnsiTheme="minorHAnsi"/>
@@ -203,67 +203,19 @@
               <w:right w:w="160" w:type="dxa"/>
             </w:tcMar>
           </w:tcPr>
-          <w:p>
+          <w:p ns2:paraId="32A9C0E1" ns2:textId="0D5A6E2A">
             <w:pPr>
               <w:rPr>
                 <w:rFonts w:asciiTheme="minorHAnsi" w:hAnsiTheme="minorHAnsi"/>
               </w:rPr>
             </w:pPr>
             <w:r>
-              <w:rPr>
-                <w:rFonts w:asciiTheme="minorHAnsi" w:hAnsiTheme="minorHAnsi"/>
-                <w:color w:val="1A1A1A"/>
-                <w:sz w:val="21"/>
-                <w:szCs w:val="21"/>
-              </w:rPr>
-              <w:fldChar w:fldCharType="begin"/>
-            </w:r>
-            <w:r>
-              <w:rPr>
-                <w:rFonts w:asciiTheme="minorHAnsi" w:hAnsiTheme="minorHAnsi"/>
-                <w:color w:val="1A1A1A"/>
-                <w:sz w:val="21"/>
-                <w:szCs w:val="21"/>
-              </w:rPr>
-              <w:instrText xml:space="preserve"> MERGEFIELD Serviço </w:instrText>
-            </w:r>
-            <w:r>
-              <w:rPr>
-                <w:rFonts w:asciiTheme="minorHAnsi" w:hAnsiTheme="minorHAnsi"/>
-                <w:color w:val="1A1A1A"/>
-                <w:sz w:val="21"/>
-                <w:szCs w:val="21"/>
-              </w:rPr>
-              <w:fldChar w:fldCharType="separate"/>
-            </w:r>
-            <w:r>
-              <w:rPr>
-                <w:rFonts w:asciiTheme="minorHAnsi" w:hAnsiTheme="minorHAnsi"/>
-                <w:color w:val="1A1A1A"/>
-                <w:sz w:val="21"/>
-                <w:szCs w:val="21"/>
-              </w:rPr>
-              <w:t>{{ tipo_servico }}</w:t>
-            </w:r>
-            <w:r>
-              <w:rPr>
-                <w:rFonts w:asciiTheme="minorHAnsi" w:hAnsiTheme="minorHAnsi"/>
-                <w:color w:val="1A1A1A"/>
-                <w:sz w:val="21"/>
-                <w:szCs w:val="21"/>
-              </w:rPr>
-              <w:fldChar w:fldCharType="end"/>
-            </w:r>
-            <w:r>
-              <w:rPr>
-                <w:rFonts w:asciiTheme="minorHAnsi" w:hAnsiTheme="minorHAnsi"/>
-              </w:rPr>
-              <w:t xml:space="preserve"> </w:t>
+              <w:t xml:space="preserve">{{ tipo_servico }}</w:t>
             </w:r>
           </w:p>
         </w:tc>
       </w:tr>
-      <w:tr>
+      <w:tr ns2:paraId="28B78078" ns2:textId="77777777">
         <w:tc>
           <w:tcPr>
             <w:tcW w:w="2800" w:type="dxa"/>
@@ -281,7 +233,7 @@
               <w:right w:w="160" w:type="dxa"/>
             </w:tcMar>
           </w:tcPr>
-          <w:p>
+          <w:p ns2:paraId="3F536429" ns2:textId="77777777">
             <w:pPr>
               <w:rPr>
                 <w:rFonts w:asciiTheme="minorHAnsi" w:hAnsiTheme="minorHAnsi"/>
@@ -317,46 +269,19 @@
               <w:right w:w="160" w:type="dxa"/>
             </w:tcMar>
           </w:tcPr>
-          <w:p>
+          <w:p ns2:paraId="7D365713" ns2:textId="0CD4E9B5">
             <w:pPr>
               <w:rPr>
                 <w:rFonts w:asciiTheme="minorHAnsi" w:hAnsiTheme="minorHAnsi"/>
               </w:rPr>
             </w:pPr>
             <w:r>
-              <w:rPr>
-                <w:rFonts w:asciiTheme="minorHAnsi" w:hAnsiTheme="minorHAnsi"/>
-              </w:rPr>
-              <w:t>{{ empresa_contratada }}</w:t>
-            </w:r>
-            <w:r>
-              <w:rPr>
-                <w:rFonts w:asciiTheme="minorHAnsi" w:hAnsiTheme="minorHAnsi"/>
-              </w:rPr>
-              <w:fldChar w:fldCharType="begin"/>
-            </w:r>
-            <w:r>
-              <w:rPr>
-                <w:rFonts w:asciiTheme="minorHAnsi" w:hAnsiTheme="minorHAnsi"/>
-              </w:rPr>
-              <w:instrText xml:space="preserve"> MERGEFIELD Prestadora </w:instrText>
-            </w:r>
-            <w:r>
-              <w:rPr>
-                <w:rFonts w:asciiTheme="minorHAnsi" w:hAnsiTheme="minorHAnsi"/>
-              </w:rPr>
-              <w:fldChar w:fldCharType="separate"/>
-            </w:r>
-            <w:r>
-              <w:rPr>
-                <w:rFonts w:asciiTheme="minorHAnsi" w:hAnsiTheme="minorHAnsi"/>
-              </w:rPr>
-              <w:fldChar w:fldCharType="end"/>
+              <w:t xml:space="preserve">{{ empresa_contratada }}</w:t>
             </w:r>
           </w:p>
         </w:tc>
       </w:tr>
-      <w:tr>
+      <w:tr ns2:paraId="0AE84996" ns2:textId="77777777">
         <w:tc>
           <w:tcPr>
             <w:tcW w:w="2800" w:type="dxa"/>
@@ -374,7 +299,7 @@
               <w:right w:w="160" w:type="dxa"/>
             </w:tcMar>
           </w:tcPr>
-          <w:p>
+          <w:p ns2:paraId="22C84C25" ns2:textId="2547DC9E">
             <w:pPr>
               <w:rPr>
                 <w:rFonts w:asciiTheme="minorHAnsi" w:hAnsiTheme="minorHAnsi"/>
@@ -421,43 +346,19 @@
               <w:right w:w="160" w:type="dxa"/>
             </w:tcMar>
           </w:tcPr>
-          <w:p>
+          <w:p ns2:paraId="791DE508" ns2:textId="62AA43F5">
             <w:pPr>
               <w:rPr>
                 <w:rFonts w:asciiTheme="minorHAnsi" w:hAnsiTheme="minorHAnsi"/>
               </w:rPr>
             </w:pPr>
             <w:r>
-              <w:rPr>
-                <w:rFonts w:asciiTheme="minorHAnsi" w:hAnsiTheme="minorHAnsi"/>
-                <w:color w:val="1A1A1A"/>
-                <w:sz w:val="21"/>
-                <w:szCs w:val="21"/>
-              </w:rPr>
-              <w:t>01/07/2026</w:t>
-            </w:r>
-            <w:r>
-              <w:rPr>
-                <w:rFonts w:asciiTheme="minorHAnsi" w:hAnsiTheme="minorHAnsi"/>
-                <w:color w:val="1A1A1A"/>
-                <w:sz w:val="21"/>
-                <w:szCs w:val="21"/>
-              </w:rPr>
-              <w:t xml:space="preserve"> e </w:t>
-            </w:r>
-            <w:r>
-              <w:rPr>
-                <w:rFonts w:asciiTheme="minorHAnsi" w:hAnsiTheme="minorHAnsi"/>
-                <w:color w:val="1A1A1A"/>
-                <w:sz w:val="21"/>
-                <w:szCs w:val="21"/>
-              </w:rPr>
-              <w:t>12 meses, com renovação automática</w:t>
+              <w:t xml:space="preserve">{{ inicio_vigencia_formatada }} e {{ texto_vigencia }}</w:t>
             </w:r>
           </w:p>
         </w:tc>
       </w:tr>
-      <w:tr>
+      <w:tr ns2:paraId="4CC09242" ns2:textId="77777777">
         <w:tc>
           <w:tcPr>
             <w:tcW w:w="2800" w:type="dxa"/>
@@ -475,7 +376,7 @@
               <w:right w:w="160" w:type="dxa"/>
             </w:tcMar>
           </w:tcPr>
-          <w:p>
+          <w:p ns2:paraId="0C5BC5B4" ns2:textId="77777777">
             <w:pPr>
               <w:rPr>
                 <w:rFonts w:asciiTheme="minorHAnsi" w:hAnsiTheme="minorHAnsi"/>
@@ -511,25 +412,19 @@
               <w:right w:w="160" w:type="dxa"/>
             </w:tcMar>
           </w:tcPr>
-          <w:p>
+          <w:p ns2:paraId="37BC456F" ns2:textId="018008BF">
             <w:pPr>
               <w:rPr>
                 <w:rFonts w:asciiTheme="minorHAnsi" w:hAnsiTheme="minorHAnsi"/>
               </w:rPr>
             </w:pPr>
             <w:r>
-              <w:rPr>
-                <w:rFonts w:asciiTheme="minorHAnsi" w:hAnsiTheme="minorHAnsi"/>
-                <w:color w:val="1A1A1A"/>
-                <w:sz w:val="21"/>
-                <w:szCs w:val="21"/>
-              </w:rPr>
-              <w:t>{{ texto_forma_pagamento }}</w:t>
+              <w:t xml:space="preserve">{{ texto_forma_pagamento }}</w:t>
             </w:r>
           </w:p>
         </w:tc>
       </w:tr>
-      <w:tr>
+      <w:tr ns2:paraId="761C1B35" ns2:textId="77777777">
         <w:tc>
           <w:tcPr>
             <w:tcW w:w="2800" w:type="dxa"/>
@@ -547,7 +442,7 @@
               <w:right w:w="160" w:type="dxa"/>
             </w:tcMar>
           </w:tcPr>
-          <w:p>
+          <w:p ns2:paraId="12B7CD23" ns2:textId="77777777">
             <w:pPr>
               <w:rPr>
                 <w:rFonts w:asciiTheme="minorHAnsi" w:hAnsiTheme="minorHAnsi"/>
@@ -583,25 +478,19 @@
               <w:right w:w="160" w:type="dxa"/>
             </w:tcMar>
           </w:tcPr>
-          <w:p>
+          <w:p ns2:paraId="3045856B" ns2:textId="3D4A4BF3">
             <w:pPr>
               <w:rPr>
                 <w:rFonts w:asciiTheme="minorHAnsi" w:hAnsiTheme="minorHAnsi"/>
               </w:rPr>
             </w:pPr>
             <w:r>
-              <w:rPr>
-                <w:rFonts w:asciiTheme="minorHAnsi" w:hAnsiTheme="minorHAnsi"/>
-                <w:color w:val="1A1A1A"/>
-                <w:sz w:val="21"/>
-                <w:szCs w:val="21"/>
-              </w:rPr>
-              <w:t>{{ texto_reajuste }}</w:t>
+              <w:t xml:space="preserve">{{ texto_reajuste }}</w:t>
             </w:r>
           </w:p>
         </w:tc>
       </w:tr>
-      <w:tr>
+      <w:tr ns2:paraId="1DAADBB9" ns2:textId="77777777">
         <w:tc>
           <w:tcPr>
             <w:tcW w:w="2800" w:type="dxa"/>
@@ -619,7 +508,7 @@
               <w:right w:w="160" w:type="dxa"/>
             </w:tcMar>
           </w:tcPr>
-          <w:p>
+          <w:p ns2:paraId="2F4CA914" ns2:textId="77777777">
             <w:pPr>
               <w:rPr>
                 <w:rFonts w:asciiTheme="minorHAnsi" w:hAnsiTheme="minorHAnsi"/>
@@ -655,25 +544,19 @@
               <w:right w:w="160" w:type="dxa"/>
             </w:tcMar>
           </w:tcPr>
-          <w:p>
+          <w:p ns2:paraId="2AFF429A" ns2:textId="4912E47F">
             <w:pPr>
               <w:rPr>
                 <w:rFonts w:asciiTheme="minorHAnsi" w:hAnsiTheme="minorHAnsi"/>
               </w:rPr>
             </w:pPr>
             <w:r>
-              <w:rPr>
-                <w:rFonts w:asciiTheme="minorHAnsi" w:hAnsiTheme="minorHAnsi"/>
-                <w:color w:val="1A1A1A"/>
-                <w:sz w:val="21"/>
-                <w:szCs w:val="21"/>
-              </w:rPr>
-              <w:t>{{ label_decima_terceira_parcela }}</w:t>
+              <w:t xml:space="preserve">{{ label_decima_terceira_parcela }}</w:t>
             </w:r>
           </w:p>
         </w:tc>
       </w:tr>
-      <w:tr>
+      <w:tr ns2:paraId="534559E1" ns2:textId="77777777">
         <w:tc>
           <w:tcPr>
             <w:tcW w:w="2800" w:type="dxa"/>
@@ -691,7 +574,7 @@
               <w:right w:w="160" w:type="dxa"/>
             </w:tcMar>
           </w:tcPr>
-          <w:p>
+          <w:p ns2:paraId="3EBC1083" ns2:textId="77777777">
             <w:pPr>
               <w:rPr>
                 <w:rFonts w:asciiTheme="minorHAnsi" w:hAnsiTheme="minorHAnsi"/>
@@ -727,25 +610,19 @@
               <w:right w:w="160" w:type="dxa"/>
             </w:tcMar>
           </w:tcPr>
-          <w:p>
+          <w:p ns2:paraId="4FD2564B" ns2:textId="17C95F27">
             <w:pPr>
               <w:rPr>
                 <w:rFonts w:asciiTheme="minorHAnsi" w:hAnsiTheme="minorHAnsi"/>
               </w:rPr>
             </w:pPr>
             <w:r>
-              <w:rPr>
-                <w:rFonts w:asciiTheme="minorHAnsi" w:hAnsiTheme="minorHAnsi"/>
-                <w:color w:val="1A1A1A"/>
-                <w:sz w:val="21"/>
-                <w:szCs w:val="21"/>
-              </w:rPr>
-              <w:t>{{ label_rescisao }}</w:t>
+              <w:t xml:space="preserve">{{ label_rescisao }}</w:t>
             </w:r>
           </w:p>
         </w:tc>
       </w:tr>
-      <w:tr>
+      <w:tr ns2:paraId="1D372202" ns2:textId="77777777">
         <w:tc>
           <w:tcPr>
             <w:tcW w:w="2800" w:type="dxa"/>
@@ -763,7 +640,7 @@
               <w:right w:w="160" w:type="dxa"/>
             </w:tcMar>
           </w:tcPr>
-          <w:p>
+          <w:p ns2:paraId="2695F664" ns2:textId="77777777">
             <w:pPr>
               <w:rPr>
                 <w:rFonts w:asciiTheme="minorHAnsi" w:hAnsiTheme="minorHAnsi"/>
@@ -799,25 +676,19 @@
               <w:right w:w="160" w:type="dxa"/>
             </w:tcMar>
           </w:tcPr>
-          <w:p>
+          <w:p ns2:paraId="621A1226" ns2:textId="6E55B125">
             <w:pPr>
               <w:rPr>
                 <w:rFonts w:asciiTheme="minorHAnsi" w:hAnsiTheme="minorHAnsi"/>
               </w:rPr>
             </w:pPr>
             <w:r>
-              <w:rPr>
-                <w:rFonts w:asciiTheme="minorHAnsi" w:hAnsiTheme="minorHAnsi"/>
-                <w:color w:val="1A1A1A"/>
-                <w:sz w:val="21"/>
-                <w:szCs w:val="21"/>
-              </w:rPr>
-              <w:t>{{ label_suspensao }}</w:t>
+              <w:t xml:space="preserve">{{ label_suspensao }}</w:t>
             </w:r>
           </w:p>
         </w:tc>
       </w:tr>
-      <w:tr>
+      <w:tr ns2:paraId="24584148" ns2:textId="77777777">
         <w:tc>
           <w:tcPr>
             <w:tcW w:w="2800" w:type="dxa"/>
@@ -835,7 +706,7 @@
               <w:right w:w="160" w:type="dxa"/>
             </w:tcMar>
           </w:tcPr>
-          <w:p>
+          <w:p ns2:paraId="67207746" ns2:textId="77777777">
             <w:pPr>
               <w:rPr>
                 <w:rFonts w:asciiTheme="minorHAnsi" w:hAnsiTheme="minorHAnsi"/>
@@ -871,26 +742,20 @@
               <w:right w:w="160" w:type="dxa"/>
             </w:tcMar>
           </w:tcPr>
-          <w:p>
+          <w:p ns2:paraId="638C9C62" ns2:textId="127EB581">
             <w:pPr>
               <w:rPr>
                 <w:rFonts w:asciiTheme="minorHAnsi" w:hAnsiTheme="minorHAnsi"/>
               </w:rPr>
             </w:pPr>
             <w:r>
-              <w:rPr>
-                <w:rFonts w:asciiTheme="minorHAnsi" w:hAnsiTheme="minorHAnsi"/>
-                <w:color w:val="1A1A1A"/>
-                <w:sz w:val="21"/>
-                <w:szCs w:val="21"/>
-              </w:rPr>
-              <w:t>{{ texto_foro }}</w:t>
+              <w:t xml:space="preserve">{{ texto_foro }}</w:t>
             </w:r>
           </w:p>
         </w:tc>
       </w:tr>
     </w:tbl>
-    <w:p>
+    <w:p ns2:paraId="7D2FB5D5" ns2:textId="77777777">
       <w:pPr>
         <w:rPr>
           <w:rFonts w:asciiTheme="minorHAnsi" w:hAnsiTheme="minorHAnsi"/>
@@ -903,7 +768,7 @@
         <w:br w:type="page"/>
       </w:r>
     </w:p>
-    <w:p>
+    <w:p ns2:paraId="2A5FA8B0" ns2:textId="77777777">
       <w:pPr>
         <w:spacing w:after="320"/>
         <w:jc w:val="center"/>
@@ -924,7 +789,7 @@
         <w:t>CONTRATO DE PRESTAÇÃO DE SERVIÇOS PROFISSIONAIS</w:t>
       </w:r>
     </w:p>
-    <w:p>
+    <w:p ns2:paraId="32D7289A" ns2:textId="77777777">
       <w:pPr>
         <w:spacing w:after="120"/>
         <w:rPr>
@@ -962,7 +827,7 @@
         <w:gridCol w:w="3113"/>
         <w:gridCol w:w="1877"/>
       </w:tblGrid>
-      <w:tr>
+      <w:tr ns2:paraId="3C6EA5F8" ns2:textId="77777777">
         <w:tc>
           <w:tcPr>
             <w:tcW w:w="2263" w:type="dxa"/>
@@ -980,7 +845,7 @@
               <w:right w:w="120" w:type="dxa"/>
             </w:tcMar>
           </w:tcPr>
-          <w:p>
+          <w:p ns2:paraId="033D6C6C" ns2:textId="77777777">
             <w:pPr>
               <w:jc w:val="center"/>
               <w:rPr>
@@ -1017,7 +882,7 @@
               <w:right w:w="120" w:type="dxa"/>
             </w:tcMar>
           </w:tcPr>
-          <w:p>
+          <w:p ns2:paraId="667521DB" ns2:textId="77777777">
             <w:pPr>
               <w:jc w:val="center"/>
               <w:rPr>
@@ -1054,7 +919,7 @@
               <w:right w:w="120" w:type="dxa"/>
             </w:tcMar>
           </w:tcPr>
-          <w:p>
+          <w:p ns2:paraId="36A0B85C" ns2:textId="77777777">
             <w:pPr>
               <w:jc w:val="center"/>
               <w:rPr>
@@ -1091,7 +956,7 @@
               <w:right w:w="120" w:type="dxa"/>
             </w:tcMar>
           </w:tcPr>
-          <w:p>
+          <w:p ns2:paraId="4ECD7E2F" ns2:textId="77777777">
             <w:pPr>
               <w:jc w:val="center"/>
               <w:rPr>
@@ -1112,50 +977,126 @@
           </w:p>
         </w:tc>
       </w:tr>
-      <w:tr>
+      <w:tr ns2:paraId="6E4931DA" ns2:textId="77777777">
         <w:tc>
           <w:tcPr>
-            <w:tcW w:w="1707" w:type="dxa"/>
+            <w:tcW w:w="2263" w:type="dxa"/>
+            <w:tcBorders>
+              <w:top w:val="single" w:sz="4" w:space="0" w:color="CCCCCC"/>
+              <w:left w:val="single" w:sz="4" w:space="0" w:color="CCCCCC"/>
+              <w:bottom w:val="single" w:sz="4" w:space="0" w:color="CCCCCC"/>
+              <w:right w:val="single" w:sz="4" w:space="0" w:color="CCCCCC"/>
+            </w:tcBorders>
+            <w:shd w:val="clear" w:color="auto" w:fill="FFFFFF"/>
+            <w:tcMar>
+              <w:top w:w="80" w:type="dxa"/>
+              <w:left w:w="120" w:type="dxa"/>
+              <w:bottom w:w="80" w:type="dxa"/>
+              <w:right w:w="120" w:type="dxa"/>
+            </w:tcMar>
           </w:tcPr>
-          <w:p>
+          <w:p ns2:paraId="7BE1ED36" ns2:textId="6ABCAB25">
+            <w:pPr>
+              <w:jc w:val="center"/>
+              <w:rPr>
+                <w:rFonts w:asciiTheme="minorHAnsi" w:hAnsiTheme="minorHAnsi"/>
+              </w:rPr>
+            </w:pPr>
             <w:r>
-              <w:t>{{ cnpj }}</w:t>
+              <w:t xml:space="preserve">{{ cnpj }}</w:t>
             </w:r>
           </w:p>
         </w:tc>
         <w:tc>
           <w:tcPr>
             <w:tcW w:w="1707" w:type="dxa"/>
+            <w:tcBorders>
+              <w:top w:val="single" w:sz="4" w:space="0" w:color="CCCCCC"/>
+              <w:left w:val="single" w:sz="4" w:space="0" w:color="CCCCCC"/>
+              <w:bottom w:val="single" w:sz="4" w:space="0" w:color="CCCCCC"/>
+              <w:right w:val="single" w:sz="4" w:space="0" w:color="CCCCCC"/>
+            </w:tcBorders>
+            <w:shd w:val="clear" w:color="auto" w:fill="FFFFFF"/>
+            <w:tcMar>
+              <w:top w:w="80" w:type="dxa"/>
+              <w:left w:w="120" w:type="dxa"/>
+              <w:bottom w:w="80" w:type="dxa"/>
+              <w:right w:w="120" w:type="dxa"/>
+            </w:tcMar>
           </w:tcPr>
-          <w:p>
+          <w:p ns2:paraId="255633D2" ns2:textId="34124439">
+            <w:pPr>
+              <w:jc w:val="center"/>
+              <w:rPr>
+                <w:rFonts w:asciiTheme="minorHAnsi" w:hAnsiTheme="minorHAnsi"/>
+              </w:rPr>
+            </w:pPr>
             <w:r>
-              <w:t>{{ enquadramento }}</w:t>
+              <w:t xml:space="preserve">{{ enquadramento }}</w:t>
             </w:r>
           </w:p>
         </w:tc>
         <w:tc>
           <w:tcPr>
-            <w:tcW w:w="1707" w:type="dxa"/>
+            <w:tcW w:w="3113" w:type="dxa"/>
+            <w:tcBorders>
+              <w:top w:val="single" w:sz="4" w:space="0" w:color="CCCCCC"/>
+              <w:left w:val="single" w:sz="4" w:space="0" w:color="CCCCCC"/>
+              <w:bottom w:val="single" w:sz="4" w:space="0" w:color="CCCCCC"/>
+              <w:right w:val="single" w:sz="4" w:space="0" w:color="CCCCCC"/>
+            </w:tcBorders>
+            <w:shd w:val="clear" w:color="auto" w:fill="FFFFFF"/>
+            <w:tcMar>
+              <w:top w:w="80" w:type="dxa"/>
+              <w:left w:w="120" w:type="dxa"/>
+              <w:bottom w:w="80" w:type="dxa"/>
+              <w:right w:w="120" w:type="dxa"/>
+            </w:tcMar>
           </w:tcPr>
-          <w:p>
+          <w:p ns2:paraId="770EB4DC" ns2:textId="00EDDA94">
+            <w:pPr>
+              <w:jc w:val="center"/>
+              <w:rPr>
+                <w:rFonts w:asciiTheme="minorHAnsi" w:hAnsiTheme="minorHAnsi"/>
+              </w:rPr>
+            </w:pPr>
             <w:r>
-              <w:t>{{ razao_social }}</w:t>
+              <w:t xml:space="preserve">{{ razao_social }}</w:t>
             </w:r>
           </w:p>
         </w:tc>
         <w:tc>
           <w:tcPr>
-            <w:tcW w:w="1707" w:type="dxa"/>
+            <w:tcW w:w="1877" w:type="dxa"/>
+            <w:tcBorders>
+              <w:top w:val="single" w:sz="4" w:space="0" w:color="CCCCCC"/>
+              <w:left w:val="single" w:sz="4" w:space="0" w:color="CCCCCC"/>
+              <w:bottom w:val="single" w:sz="4" w:space="0" w:color="CCCCCC"/>
+              <w:right w:val="single" w:sz="4" w:space="0" w:color="CCCCCC"/>
+            </w:tcBorders>
+            <w:shd w:val="clear" w:color="auto" w:fill="FFFFFF"/>
+            <w:tcMar>
+              <w:top w:w="80" w:type="dxa"/>
+              <w:left w:w="120" w:type="dxa"/>
+              <w:bottom w:w="80" w:type="dxa"/>
+              <w:right w:w="120" w:type="dxa"/>
+            </w:tcMar>
           </w:tcPr>
-          <w:p>
+          <w:p ns2:paraId="0A3D5742" ns2:textId="6A2A7B32">
+            <w:pPr>
+              <w:jc w:val="center"/>
+              <w:rPr>
+                <w:rFonts w:asciiTheme="minorHAnsi" w:hAnsiTheme="minorHAnsi"/>
+              </w:rPr>
+            </w:pPr>
             <w:r>
-              <w:t>{{ valor_mensal_formatado }}</w:t>
+              <w:t xml:space="preserve">{{ valor_mensal_formatado }}</w:t>
             </w:r>
           </w:p>
         </w:tc>
       </w:tr>
     </w:tbl>
-    <w:p>
+    <w:p ns2:paraId="090A5EDA" ns2:textId="1B93CFBB">
       <w:pPr>
         <w:spacing w:before="160" w:after="80"/>
         <w:rPr>
@@ -1163,235 +1104,10 @@
         </w:rPr>
       </w:pPr>
       <w:r>
-        <w:rPr>
-          <w:rFonts w:asciiTheme="minorHAnsi" w:hAnsiTheme="minorHAnsi"/>
-          <w:color w:val="1A1A1A"/>
-        </w:rPr>
-        <w:t xml:space="preserve">Doravante denominado </w:t>
-      </w:r>
-      <w:r>
-        <w:rPr>
-          <w:rFonts w:asciiTheme="minorHAnsi" w:hAnsiTheme="minorHAnsi"/>
-          <w:b/>
-          <w:bCs/>
-        </w:rPr>
-        <w:t>CONTRATANTE</w:t>
-      </w:r>
-      <w:r>
-        <w:rPr>
-          <w:rFonts w:asciiTheme="minorHAnsi" w:hAnsiTheme="minorHAnsi"/>
-          <w:color w:val="1A1A1A"/>
-        </w:rPr>
-        <w:t xml:space="preserve">, representado por </w:t>
-      </w:r>
-      <w:r>
-        <w:rPr>
-          <w:rFonts w:asciiTheme="minorHAnsi" w:hAnsiTheme="minorHAnsi"/>
-          <w:color w:val="1A1A1A"/>
-        </w:rPr>
-        <w:t>Andreia de Oliveira Belaus</w:t>
-      </w:r>
-      <w:r>
-        <w:rPr>
-          <w:rFonts w:asciiTheme="minorHAnsi" w:hAnsiTheme="minorHAnsi"/>
-          <w:color w:val="1A1A1A"/>
-        </w:rPr>
-        <w:t>, CPF nº</w:t>
-      </w:r>
-      <w:r>
-        <w:rPr>
-          <w:rFonts w:asciiTheme="minorHAnsi" w:hAnsiTheme="minorHAnsi"/>
-          <w:color w:val="1A1A1A"/>
-        </w:rPr>
-        <w:t xml:space="preserve"> 021.751.119-89</w:t>
-      </w:r>
-      <w:r>
-        <w:rPr>
-          <w:rFonts w:asciiTheme="minorHAnsi" w:hAnsiTheme="minorHAnsi"/>
-          <w:color w:val="1A1A1A"/>
-        </w:rPr>
-        <w:t xml:space="preserve">, </w:t>
-      </w:r>
-      <w:r>
-        <w:rPr>
-          <w:rFonts w:asciiTheme="minorHAnsi" w:hAnsiTheme="minorHAnsi"/>
-          <w:color w:val="1A1A1A"/>
-        </w:rPr>
-        <w:t>Hugo Altevir Costa Lima</w:t>
-      </w:r>
-      <w:r>
-        <w:rPr>
-          <w:rFonts w:asciiTheme="minorHAnsi" w:hAnsiTheme="minorHAnsi"/>
-          <w:color w:val="1A1A1A"/>
-        </w:rPr>
-        <w:t>, CPF nº</w:t>
-      </w:r>
-      <w:r>
-        <w:rPr>
-          <w:rFonts w:asciiTheme="minorHAnsi" w:hAnsiTheme="minorHAnsi"/>
-          <w:color w:val="1A1A1A"/>
-        </w:rPr>
-        <w:t xml:space="preserve"> 382.321.119-68</w:t>
-      </w:r>
-      <w:r>
-        <w:rPr>
-          <w:rFonts w:asciiTheme="minorHAnsi" w:hAnsiTheme="minorHAnsi"/>
-          <w:color w:val="1A1A1A"/>
-        </w:rPr>
-        <w:t xml:space="preserve">, </w:t>
-      </w:r>
-      <w:r>
-        <w:rPr>
-          <w:rFonts w:asciiTheme="minorHAnsi" w:hAnsiTheme="minorHAnsi"/>
-          <w:color w:val="1A1A1A"/>
-        </w:rPr>
-        <w:t>Bruna Costa Lima</w:t>
-      </w:r>
-      <w:r>
-        <w:rPr>
-          <w:rFonts w:asciiTheme="minorHAnsi" w:hAnsiTheme="minorHAnsi"/>
-          <w:color w:val="1A1A1A"/>
-        </w:rPr>
-        <w:t>, CPF nº</w:t>
-      </w:r>
-      <w:r>
-        <w:rPr>
-          <w:rFonts w:asciiTheme="minorHAnsi" w:hAnsiTheme="minorHAnsi"/>
-          <w:color w:val="1A1A1A"/>
-        </w:rPr>
-        <w:t xml:space="preserve"> 104.932.889-29</w:t>
-      </w:r>
-      <w:r>
-        <w:rPr>
-          <w:rFonts w:asciiTheme="minorHAnsi" w:hAnsiTheme="minorHAnsi"/>
-          <w:color w:val="1A1A1A"/>
-        </w:rPr>
-        <w:t xml:space="preserve">, </w:t>
-      </w:r>
-      <w:r>
-        <w:rPr>
-          <w:rFonts w:asciiTheme="minorHAnsi" w:hAnsiTheme="minorHAnsi"/>
-          <w:color w:val="1A1A1A"/>
-        </w:rPr>
-        <w:t xml:space="preserve">e o contador </w:t>
-      </w:r>
-      <w:r>
-        <w:rPr>
-          <w:rFonts w:asciiTheme="minorHAnsi" w:hAnsiTheme="minorHAnsi"/>
-          <w:b/>
-          <w:bCs/>
-        </w:rPr>
-        <w:t>André Abdom Ximenes Cavalcanti</w:t>
-      </w:r>
-      <w:r>
-        <w:rPr>
-          <w:rFonts w:asciiTheme="minorHAnsi" w:hAnsiTheme="minorHAnsi"/>
-          <w:color w:val="1A1A1A"/>
-        </w:rPr>
-        <w:t xml:space="preserve">, com escritório </w:t>
-      </w:r>
-      <w:r>
-        <w:rPr>
-          <w:rFonts w:asciiTheme="minorHAnsi" w:hAnsiTheme="minorHAnsi"/>
-          <w:b/>
-          <w:bCs/>
-        </w:rPr>
-        <w:t>Valore Contadores Associados LTDA</w:t>
-      </w:r>
-      <w:r>
-        <w:rPr>
-          <w:rFonts w:asciiTheme="minorHAnsi" w:hAnsiTheme="minorHAnsi"/>
-          <w:color w:val="1A1A1A"/>
-        </w:rPr>
-        <w:t xml:space="preserve">, CNPJ </w:t>
-      </w:r>
-      <w:r>
-        <w:rPr>
-          <w:rFonts w:asciiTheme="minorHAnsi" w:hAnsiTheme="minorHAnsi"/>
-          <w:color w:val="1A1A1A"/>
-        </w:rPr>
-        <w:t>24.863.877/0001-74</w:t>
-      </w:r>
-      <w:r>
-        <w:rPr>
-          <w:rFonts w:asciiTheme="minorHAnsi" w:hAnsiTheme="minorHAnsi"/>
-          <w:color w:val="1A1A1A"/>
-        </w:rPr>
-        <w:t xml:space="preserve">, </w:t>
-      </w:r>
-      <w:r>
-        <w:rPr>
-          <w:rFonts w:asciiTheme="minorHAnsi" w:hAnsiTheme="minorHAnsi"/>
-          <w:color w:val="1A1A1A"/>
-        </w:rPr>
-        <w:t>Rua Irmã Maria David, 99</w:t>
-      </w:r>
-      <w:r>
-        <w:rPr>
-          <w:rFonts w:asciiTheme="minorHAnsi" w:hAnsiTheme="minorHAnsi"/>
-          <w:color w:val="1A1A1A"/>
-        </w:rPr>
-        <w:t xml:space="preserve">, CRC nº </w:t>
-      </w:r>
-      <w:r>
-        <w:rPr>
-          <w:rFonts w:asciiTheme="minorHAnsi" w:hAnsiTheme="minorHAnsi"/>
-          <w:color w:val="1A1A1A"/>
-        </w:rPr>
-        <w:t>PE-030717/O</w:t>
-      </w:r>
-      <w:r>
-        <w:rPr>
-          <w:rFonts w:asciiTheme="minorHAnsi" w:hAnsiTheme="minorHAnsi"/>
-          <w:color w:val="1A1A1A"/>
-        </w:rPr>
-        <w:fldChar w:fldCharType="begin"/>
-      </w:r>
-      <w:r>
-        <w:rPr>
-          <w:rFonts w:asciiTheme="minorHAnsi" w:hAnsiTheme="minorHAnsi"/>
-          <w:color w:val="1A1A1A"/>
-        </w:rPr>
-        <w:instrText xml:space="preserve"> MERGEFIELD CRC_Contratado </w:instrText>
-      </w:r>
-      <w:r>
-        <w:rPr>
-          <w:rFonts w:asciiTheme="minorHAnsi" w:hAnsiTheme="minorHAnsi"/>
-          <w:color w:val="1A1A1A"/>
-        </w:rPr>
-        <w:fldChar w:fldCharType="separate"/>
-      </w:r>
-      <w:r>
-        <w:rPr>
-          <w:rFonts w:asciiTheme="minorHAnsi" w:hAnsiTheme="minorHAnsi"/>
-          <w:color w:val="1A1A1A"/>
-        </w:rPr>
-        <w:fldChar w:fldCharType="end"/>
-      </w:r>
-      <w:r>
-        <w:rPr>
-          <w:rFonts w:asciiTheme="minorHAnsi" w:hAnsiTheme="minorHAnsi"/>
-          <w:color w:val="1A1A1A"/>
-        </w:rPr>
-        <w:t xml:space="preserve">, doravante denominado </w:t>
-      </w:r>
-      <w:r>
-        <w:rPr>
-          <w:rFonts w:asciiTheme="minorHAnsi" w:hAnsiTheme="minorHAnsi"/>
-          <w:b/>
-          <w:bCs/>
-        </w:rPr>
-        <w:t>CONTRATADA</w:t>
-      </w:r>
-      <w:r>
-        <w:rPr>
-          <w:rFonts w:asciiTheme="minorHAnsi" w:hAnsiTheme="minorHAnsi"/>
-          <w:color w:val="1A1A1A"/>
-        </w:rPr>
-        <w:t>.</w:t>
-      </w:r>
-    </w:p>
-    <w:p>
+        <w:t xml:space="preserve">{{ texto_partes }}</w:t>
+      </w:r>
+    </w:p>
+    <w:p ns2:paraId="6DE57EF9" ns2:textId="77777777">
       <w:pPr>
         <w:pBdr>
           <w:bottom w:val="single" w:sz="6" w:space="4" w:color="E06020"/>
@@ -1413,7 +1129,7 @@
         <w:t>1. OBJETO</w:t>
       </w:r>
     </w:p>
-    <w:p>
+    <w:p ns2:paraId="184515FD" ns2:textId="77777777">
       <w:pPr>
         <w:spacing w:before="80" w:after="80"/>
         <w:ind w:left="360"/>
@@ -1454,7 +1170,7 @@
         <w:t xml:space="preserve"> pela CONTRATADA à CONTRATANTE, conforme descrito na Cláusula 2.</w:t>
       </w:r>
     </w:p>
-    <w:p>
+    <w:p ns2:paraId="2D694462" ns2:textId="77777777">
       <w:pPr>
         <w:pBdr>
           <w:bottom w:val="single" w:sz="6" w:space="4" w:color="E06020"/>
@@ -1476,7 +1192,7 @@
         <w:t>2. SERVIÇOS</w:t>
       </w:r>
     </w:p>
-    <w:p>
+    <w:p ns2:paraId="3A71234B" ns2:textId="70519DF0">
       <w:pPr>
         <w:spacing w:before="80" w:after="80"/>
         <w:ind w:left="360"/>
@@ -1501,7 +1217,7 @@
         <w:t>A CONTRATANTE declara estar enquadrada sob o regime tributário:</w:t>
       </w:r>
     </w:p>
-    <w:p>
+    <w:p ns2:paraId="133519F3" ns2:textId="07CCCDFF">
       <w:pPr>
         <w:spacing w:before="80" w:after="80"/>
         <w:ind w:left="360"/>
@@ -1510,13 +1226,10 @@
         </w:rPr>
       </w:pPr>
       <w:r>
-        <w:rPr>
-          <w:rFonts w:asciiTheme="minorHAnsi" w:hAnsiTheme="minorHAnsi"/>
-        </w:rPr>
-        <w:t>{{ texto_regime_tributario }}.</w:t>
-      </w:r>
-    </w:p>
-    <w:p>
+        <w:t xml:space="preserve">{{ texto_regime_tributario }}</w:t>
+      </w:r>
+    </w:p>
+    <w:p ns2:paraId="376BF127" ns2:textId="77777777">
       <w:pPr>
         <w:spacing w:before="80" w:after="80"/>
         <w:ind w:left="360"/>
@@ -1525,7 +1238,7 @@
         </w:rPr>
       </w:pPr>
     </w:p>
-    <w:p>
+    <w:p ns2:paraId="61B59C45" ns2:textId="77313FDD">
       <w:pPr>
         <w:spacing w:before="80" w:after="80"/>
         <w:ind w:left="360"/>
@@ -1534,23 +1247,10 @@
         </w:rPr>
       </w:pPr>
       <w:r>
-        <w:rPr>
-          <w:rFonts w:asciiTheme="minorHAnsi" w:hAnsiTheme="minorHAnsi"/>
-          <w:b/>
-          <w:bCs/>
-          <w:color w:val="2E6DA4"/>
-        </w:rPr>
-        <w:t xml:space="preserve">2.2  </w:t>
-      </w:r>
-      <w:r>
-        <w:rPr>
-          <w:rFonts w:asciiTheme="minorHAnsi" w:hAnsiTheme="minorHAnsi"/>
-          <w:color w:val="1A1A1A"/>
-        </w:rPr>
-        <w:t>A CONTRATADA será responsável pelos seguintes serviços mensais:</w:t>
-      </w:r>
-    </w:p>
-    <w:p>
+        <w:t xml:space="preserve">{{ texto_detalhamento_servico }}</w:t>
+      </w:r>
+    </w:p>
+    <w:p ns2:paraId="61C7E931" ns2:textId="022D578A">
       <w:pPr>
         <w:spacing w:before="80" w:after="80"/>
         <w:ind w:left="360"/>
@@ -1561,11 +1261,371 @@
       <w:r>
         <w:rPr>
           <w:rFonts w:asciiTheme="minorHAnsi" w:hAnsiTheme="minorHAnsi"/>
-        </w:rPr>
-        <w:t>a) Assessoria Contábil:</w:t>
-      </w:r>
-    </w:p>
-    <w:p>
+          <w:b/>
+          <w:bCs/>
+          <w:color w:val="2E6DA4"/>
+        </w:rPr>
+        <w:t xml:space="preserve">2.3  </w:t>
+      </w:r>
+      <w:r>
+        <w:rPr>
+          <w:rFonts w:asciiTheme="minorHAnsi" w:hAnsiTheme="minorHAnsi"/>
+          <w:color w:val="1A1A1A"/>
+        </w:rPr>
+        <w:t>Serviços extraordinários — não incluídos no escopo acima — poderão ser contratados separadamente, mediante orçamento prévio aprovado pela CONTRATANTE, por e-mail. São exemplos:</w:t>
+      </w:r>
+    </w:p>
+    <w:p ns2:paraId="4D49E028" ns2:textId="77777777">
+      <w:pPr>
+        <w:spacing w:before="60" w:after="60"/>
+        <w:ind w:left="720" w:hanging="360"/>
+        <w:rPr>
+          <w:rFonts w:asciiTheme="minorHAnsi" w:hAnsiTheme="minorHAnsi"/>
+        </w:rPr>
+      </w:pPr>
+      <w:r>
+        <w:rPr>
+          <w:rFonts w:asciiTheme="minorHAnsi" w:hAnsiTheme="minorHAnsi"/>
+          <w:b/>
+          <w:bCs/>
+          <w:color w:val="E06020"/>
+        </w:rPr>
+        <w:t xml:space="preserve">• </w:t>
+      </w:r>
+      <w:r>
+        <w:rPr>
+          <w:rFonts w:asciiTheme="minorHAnsi" w:hAnsiTheme="minorHAnsi"/>
+          <w:color w:val="1A1A1A"/>
+        </w:rPr>
+        <w:t>Processos paralegais (alteração contratual, abertura de filiais, inscrição estadual em outra UF);</w:t>
+      </w:r>
+    </w:p>
+    <w:p ns2:paraId="262932D4" ns2:textId="77777777">
+      <w:pPr>
+        <w:spacing w:before="60" w:after="60"/>
+        <w:ind w:left="720" w:hanging="360"/>
+        <w:rPr>
+          <w:rFonts w:asciiTheme="minorHAnsi" w:hAnsiTheme="minorHAnsi"/>
+        </w:rPr>
+      </w:pPr>
+      <w:r>
+        <w:rPr>
+          <w:rFonts w:asciiTheme="minorHAnsi" w:hAnsiTheme="minorHAnsi"/>
+          <w:b/>
+          <w:bCs/>
+          <w:color w:val="E06020"/>
+        </w:rPr>
+        <w:t xml:space="preserve">• </w:t>
+      </w:r>
+      <w:r>
+        <w:rPr>
+          <w:rFonts w:asciiTheme="minorHAnsi" w:hAnsiTheme="minorHAnsi"/>
+          <w:color w:val="1A1A1A"/>
+        </w:rPr>
+        <w:t>Obtenção de certidões negativas (INSS, FGTS, ICMS, ISS) mais de uma vez por mês;</w:t>
+      </w:r>
+    </w:p>
+    <w:p ns2:paraId="158FAFC2" ns2:textId="77777777">
+      <w:pPr>
+        <w:spacing w:before="60" w:after="60"/>
+        <w:ind w:left="720" w:hanging="360"/>
+        <w:rPr>
+          <w:rFonts w:asciiTheme="minorHAnsi" w:hAnsiTheme="minorHAnsi"/>
+          <w:color w:val="1A1A1A"/>
+        </w:rPr>
+      </w:pPr>
+      <w:r>
+        <w:rPr>
+          <w:rFonts w:asciiTheme="minorHAnsi" w:hAnsiTheme="minorHAnsi"/>
+          <w:b/>
+          <w:bCs/>
+          <w:color w:val="E06020"/>
+        </w:rPr>
+        <w:t xml:space="preserve">• </w:t>
+      </w:r>
+      <w:r>
+        <w:rPr>
+          <w:rFonts w:asciiTheme="minorHAnsi" w:hAnsiTheme="minorHAnsi"/>
+          <w:color w:val="1A1A1A"/>
+        </w:rPr>
+        <w:t>Certidão negativa de falências ou protestos;</w:t>
+      </w:r>
+    </w:p>
+    <w:p ns2:paraId="24EEFBFD" ns2:textId="2524B1E1">
+      <w:pPr>
+        <w:spacing w:before="60" w:after="60"/>
+        <w:ind w:left="720" w:hanging="360"/>
+        <w:rPr>
+          <w:rFonts w:asciiTheme="minorHAnsi" w:hAnsiTheme="minorHAnsi"/>
+        </w:rPr>
+      </w:pPr>
+      <w:r>
+        <w:rPr>
+          <w:rFonts w:asciiTheme="minorHAnsi" w:hAnsiTheme="minorHAnsi"/>
+          <w:b/>
+          <w:bCs/>
+          <w:color w:val="E06020"/>
+        </w:rPr>
+        <w:t xml:space="preserve">• </w:t>
+      </w:r>
+      <w:r>
+        <w:rPr>
+          <w:rFonts w:asciiTheme="minorHAnsi" w:hAnsiTheme="minorHAnsi"/>
+          <w:color w:val="1A1A1A"/>
+        </w:rPr>
+        <w:t>Emissão de Notas Fiscais em nome da CONTRATANTE</w:t>
+      </w:r>
+      <w:r>
+        <w:rPr>
+          <w:rFonts w:asciiTheme="minorHAnsi" w:hAnsiTheme="minorHAnsi"/>
+          <w:color w:val="1A1A1A"/>
+        </w:rPr>
+        <w:t>;</w:t>
+      </w:r>
+    </w:p>
+    <w:p ns2:paraId="4456568E" ns2:textId="77777777">
+      <w:pPr>
+        <w:spacing w:before="60" w:after="60"/>
+        <w:ind w:left="720" w:hanging="360"/>
+        <w:rPr>
+          <w:rFonts w:asciiTheme="minorHAnsi" w:hAnsiTheme="minorHAnsi"/>
+        </w:rPr>
+      </w:pPr>
+      <w:r>
+        <w:rPr>
+          <w:rFonts w:asciiTheme="minorHAnsi" w:hAnsiTheme="minorHAnsi"/>
+          <w:b/>
+          <w:bCs/>
+          <w:color w:val="E06020"/>
+        </w:rPr>
+        <w:t xml:space="preserve">• </w:t>
+      </w:r>
+      <w:r>
+        <w:rPr>
+          <w:rFonts w:asciiTheme="minorHAnsi" w:hAnsiTheme="minorHAnsi"/>
+          <w:color w:val="1A1A1A"/>
+        </w:rPr>
+        <w:t>Preenchimento de fichas cadastrais / IBGE;</w:t>
+      </w:r>
+    </w:p>
+    <w:p ns2:paraId="3F435E74" ns2:textId="77777777">
+      <w:pPr>
+        <w:spacing w:before="60" w:after="60"/>
+        <w:ind w:left="720" w:hanging="360"/>
+        <w:rPr>
+          <w:rFonts w:asciiTheme="minorHAnsi" w:hAnsiTheme="minorHAnsi"/>
+        </w:rPr>
+      </w:pPr>
+      <w:r>
+        <w:rPr>
+          <w:rFonts w:asciiTheme="minorHAnsi" w:hAnsiTheme="minorHAnsi"/>
+          <w:b/>
+          <w:bCs/>
+          <w:color w:val="E06020"/>
+        </w:rPr>
+        <w:t xml:space="preserve">• </w:t>
+      </w:r>
+      <w:r>
+        <w:rPr>
+          <w:rFonts w:asciiTheme="minorHAnsi" w:hAnsiTheme="minorHAnsi"/>
+          <w:color w:val="1A1A1A"/>
+        </w:rPr>
+        <w:t>Reemissão de guias de impostos mais de uma vez por mês;</w:t>
+      </w:r>
+    </w:p>
+    <w:p ns2:paraId="168B4BF4" ns2:textId="77777777">
+      <w:pPr>
+        <w:spacing w:before="60" w:after="60"/>
+        <w:ind w:left="720" w:hanging="360"/>
+        <w:rPr>
+          <w:rFonts w:asciiTheme="minorHAnsi" w:hAnsiTheme="minorHAnsi"/>
+        </w:rPr>
+      </w:pPr>
+      <w:r>
+        <w:rPr>
+          <w:rFonts w:asciiTheme="minorHAnsi" w:hAnsiTheme="minorHAnsi"/>
+          <w:b/>
+          <w:bCs/>
+          <w:color w:val="E06020"/>
+        </w:rPr>
+        <w:t xml:space="preserve">• </w:t>
+      </w:r>
+      <w:r>
+        <w:rPr>
+          <w:rFonts w:asciiTheme="minorHAnsi" w:hAnsiTheme="minorHAnsi"/>
+          <w:color w:val="1A1A1A"/>
+        </w:rPr>
+        <w:t>Diligências presenciais em órgãos públicos;</w:t>
+      </w:r>
+    </w:p>
+    <w:p ns2:paraId="78ED91E0" ns2:textId="3EAECD22">
+      <w:pPr>
+        <w:spacing w:before="60" w:after="60"/>
+        <w:ind w:left="720" w:hanging="360"/>
+        <w:rPr>
+          <w:rFonts w:asciiTheme="minorHAnsi" w:hAnsiTheme="minorHAnsi"/>
+          <w:color w:val="1A1A1A"/>
+        </w:rPr>
+      </w:pPr>
+      <w:r>
+        <w:rPr>
+          <w:rFonts w:asciiTheme="minorHAnsi" w:hAnsiTheme="minorHAnsi"/>
+          <w:b/>
+          <w:bCs/>
+          <w:color w:val="E06020"/>
+        </w:rPr>
+        <w:t xml:space="preserve">• </w:t>
+      </w:r>
+      <w:r>
+        <w:rPr>
+          <w:rFonts w:asciiTheme="minorHAnsi" w:hAnsiTheme="minorHAnsi"/>
+          <w:color w:val="1A1A1A"/>
+        </w:rPr>
+        <w:t>Cálculo, emissão e recebimento de RPA</w:t>
+      </w:r>
+      <w:r>
+        <w:rPr>
+          <w:rFonts w:asciiTheme="minorHAnsi" w:hAnsiTheme="minorHAnsi"/>
+          <w:color w:val="1A1A1A"/>
+        </w:rPr>
+        <w:t>;</w:t>
+      </w:r>
+    </w:p>
+    <w:p ns2:paraId="5468FF10" ns2:textId="7BFE03A8">
+      <w:pPr>
+        <w:spacing w:before="60" w:after="60"/>
+        <w:ind w:left="720" w:hanging="360"/>
+        <w:rPr>
+          <w:rFonts w:asciiTheme="minorHAnsi" w:hAnsiTheme="minorHAnsi"/>
+          <w:color w:val="1A1A1A"/>
+        </w:rPr>
+      </w:pPr>
+      <w:r>
+        <w:rPr>
+          <w:rFonts w:asciiTheme="minorHAnsi" w:hAnsiTheme="minorHAnsi"/>
+          <w:b/>
+          <w:bCs/>
+          <w:color w:val="E06020"/>
+        </w:rPr>
+        <w:t>•</w:t>
+      </w:r>
+      <w:r>
+        <w:rPr>
+          <w:rFonts w:asciiTheme="minorHAnsi" w:hAnsiTheme="minorHAnsi"/>
+          <w:b/>
+          <w:bCs/>
+          <w:color w:val="E06020"/>
+        </w:rPr>
+        <w:t xml:space="preserve"> </w:t>
+      </w:r>
+      <w:r>
+        <w:rPr>
+          <w:rFonts w:asciiTheme="minorHAnsi" w:hAnsiTheme="minorHAnsi"/>
+          <w:color w:val="1A1A1A"/>
+        </w:rPr>
+        <w:t>Simulação de Preço de produtos e serviços;</w:t>
+      </w:r>
+    </w:p>
+    <w:p ns2:paraId="1E107C4A" ns2:textId="758C0E63">
+      <w:pPr>
+        <w:spacing w:before="60" w:after="60"/>
+        <w:ind w:left="720" w:hanging="360"/>
+        <w:rPr>
+          <w:rFonts w:asciiTheme="minorHAnsi" w:hAnsiTheme="minorHAnsi"/>
+        </w:rPr>
+      </w:pPr>
+      <w:r>
+        <w:rPr>
+          <w:rFonts w:asciiTheme="minorHAnsi" w:hAnsiTheme="minorHAnsi"/>
+          <w:b/>
+          <w:bCs/>
+          <w:color w:val="E06020"/>
+        </w:rPr>
+        <w:t>•</w:t>
+      </w:r>
+      <w:r>
+        <w:rPr>
+          <w:rFonts w:asciiTheme="minorHAnsi" w:hAnsiTheme="minorHAnsi"/>
+          <w:b/>
+          <w:bCs/>
+          <w:color w:val="E06020"/>
+        </w:rPr>
+        <w:t xml:space="preserve"> </w:t>
+      </w:r>
+      <w:r>
+        <w:rPr>
+          <w:rFonts w:asciiTheme="minorHAnsi" w:hAnsiTheme="minorHAnsi"/>
+          <w:color w:val="1A1A1A"/>
+        </w:rPr>
+        <w:t xml:space="preserve">Simulação de </w:t>
+      </w:r>
+      <w:r>
+        <w:rPr>
+          <w:rFonts w:asciiTheme="minorHAnsi" w:hAnsiTheme="minorHAnsi"/>
+          <w:color w:val="1A1A1A"/>
+        </w:rPr>
+        <w:t>tributária para o Lucro Real</w:t>
+      </w:r>
+      <w:r>
+        <w:rPr>
+          <w:rFonts w:asciiTheme="minorHAnsi" w:hAnsiTheme="minorHAnsi"/>
+          <w:color w:val="1A1A1A"/>
+        </w:rPr>
+        <w:t>;</w:t>
+      </w:r>
+    </w:p>
+    <w:p ns2:paraId="50FF27C3" ns2:textId="60CC9302">
+      <w:pPr>
+        <w:spacing w:before="60" w:after="60"/>
+        <w:ind w:left="720" w:hanging="360"/>
+        <w:rPr>
+          <w:rFonts w:asciiTheme="minorHAnsi" w:hAnsiTheme="minorHAnsi"/>
+          <w:color w:val="1A1A1A"/>
+        </w:rPr>
+      </w:pPr>
+      <w:r>
+        <w:rPr>
+          <w:rFonts w:asciiTheme="minorHAnsi" w:hAnsiTheme="minorHAnsi"/>
+          <w:b/>
+          <w:bCs/>
+          <w:color w:val="E06020"/>
+        </w:rPr>
+        <w:t>•</w:t>
+      </w:r>
+      <w:r>
+        <w:rPr>
+          <w:rFonts w:asciiTheme="minorHAnsi" w:hAnsiTheme="minorHAnsi"/>
+          <w:b/>
+          <w:bCs/>
+          <w:color w:val="E06020"/>
+        </w:rPr>
+        <w:t xml:space="preserve"> </w:t>
+      </w:r>
+      <w:r>
+        <w:rPr>
+          <w:rFonts w:asciiTheme="minorHAnsi" w:hAnsiTheme="minorHAnsi"/>
+          <w:color w:val="1A1A1A"/>
+        </w:rPr>
+        <w:t>Atendimento de malhas fiscais de períodos anteriores à vigência do contrato</w:t>
+      </w:r>
+      <w:r>
+        <w:rPr>
+          <w:rFonts w:asciiTheme="minorHAnsi" w:hAnsiTheme="minorHAnsi"/>
+          <w:color w:val="1A1A1A"/>
+        </w:rPr>
+        <w:t>;</w:t>
+      </w:r>
+    </w:p>
+    <w:p ns2:paraId="7D3DE43F" ns2:textId="77777777">
+      <w:pPr>
+        <w:spacing w:before="60" w:after="60"/>
+        <w:ind w:left="720" w:hanging="360"/>
+        <w:rPr>
+          <w:rFonts w:asciiTheme="minorHAnsi" w:hAnsiTheme="minorHAnsi"/>
+        </w:rPr>
+      </w:pPr>
+    </w:p>
+    <w:p ns2:paraId="1AD6833B" ns2:textId="53EEF812">
       <w:pPr>
         <w:spacing w:before="80" w:after="80"/>
         <w:ind w:left="360"/>
@@ -1576,499 +1636,6 @@
       <w:r>
         <w:rPr>
           <w:rFonts w:asciiTheme="minorHAnsi" w:hAnsiTheme="minorHAnsi"/>
-        </w:rPr>
-        <w:t xml:space="preserve">Classificação da contabilidade de acordo com normas e princípios contábeis vigentes; emissão dos balancetes em periodicidade </w:t>
-      </w:r>
-      <w:r>
-        <w:rPr>
-          <w:rFonts w:asciiTheme="minorHAnsi" w:hAnsiTheme="minorHAnsi"/>
-        </w:rPr>
-        <w:t>trimestral</w:t>
-      </w:r>
-      <w:r>
-        <w:rPr>
-          <w:rFonts w:asciiTheme="minorHAnsi" w:hAnsiTheme="minorHAnsi"/>
-        </w:rPr>
-        <w:t>; elaboração de balaço anual e demais demonstrações contábeis obrigatórias (“Serviços Contábeis”).</w:t>
-      </w:r>
-    </w:p>
-    <w:p>
-      <w:pPr>
-        <w:spacing w:before="80" w:after="80"/>
-        <w:ind w:left="360"/>
-        <w:rPr>
-          <w:rFonts w:asciiTheme="minorHAnsi" w:hAnsiTheme="minorHAnsi"/>
-        </w:rPr>
-      </w:pPr>
-    </w:p>
-    <w:p>
-      <w:pPr>
-        <w:spacing w:before="80" w:after="80"/>
-        <w:ind w:left="360"/>
-        <w:rPr>
-          <w:rFonts w:asciiTheme="minorHAnsi" w:hAnsiTheme="minorHAnsi"/>
-        </w:rPr>
-      </w:pPr>
-      <w:r>
-        <w:rPr>
-          <w:rFonts w:asciiTheme="minorHAnsi" w:hAnsiTheme="minorHAnsi"/>
-        </w:rPr>
-        <w:t>b) Assessoria Fiscal:</w:t>
-      </w:r>
-    </w:p>
-    <w:p>
-      <w:pPr>
-        <w:spacing w:before="80" w:after="80"/>
-        <w:ind w:left="360"/>
-        <w:rPr>
-          <w:rFonts w:asciiTheme="minorHAnsi" w:hAnsiTheme="minorHAnsi"/>
-        </w:rPr>
-      </w:pPr>
-      <w:r>
-        <w:rPr>
-          <w:rFonts w:asciiTheme="minorHAnsi" w:hAnsiTheme="minorHAnsi"/>
-        </w:rPr>
-        <w:t>Orientação e controle da aplicação dos dispositivos legais vigentes, sejam federais, estaduais ou municipais; escrituração dos registros fiscais de todos os livros obrigatórios perante o governo federal, estadual e municipal; cálculo e emissão das guias de impostos, pró labore, transmissão das obrigações acessórias como, por exemplo, DestDa, DEFIS e demais obrigatórias por lei para o enquadramento do Simples Nacional; DCTF, EFD Contribuições, EFD ICMS/IPI, ECF, ECD e demais transmissões para o enquadramento no Lucro Presumido, Lucro Real ou  Outras; transmissão e homologação dos livros contábeis e fiscais na Junta Comercial; e atendimento das demais exigências previstas na legislação brasileira (“Serviços Fiscais”).</w:t>
-      </w:r>
-    </w:p>
-    <w:p>
-      <w:pPr>
-        <w:spacing w:before="80" w:after="80"/>
-        <w:ind w:left="360"/>
-        <w:rPr>
-          <w:rFonts w:asciiTheme="minorHAnsi" w:hAnsiTheme="minorHAnsi"/>
-        </w:rPr>
-      </w:pPr>
-    </w:p>
-    <w:p>
-      <w:pPr>
-        <w:spacing w:before="80" w:after="80"/>
-        <w:ind w:left="360"/>
-        <w:rPr>
-          <w:rFonts w:asciiTheme="minorHAnsi" w:hAnsiTheme="minorHAnsi"/>
-        </w:rPr>
-      </w:pPr>
-      <w:r>
-        <w:rPr>
-          <w:rFonts w:asciiTheme="minorHAnsi" w:hAnsiTheme="minorHAnsi"/>
-        </w:rPr>
-        <w:t>c) Assessoria Trabalhista:</w:t>
-      </w:r>
-    </w:p>
-    <w:p>
-      <w:pPr>
-        <w:spacing w:before="80" w:after="80"/>
-        <w:ind w:left="360"/>
-        <w:rPr>
-          <w:rFonts w:asciiTheme="minorHAnsi" w:hAnsiTheme="minorHAnsi"/>
-        </w:rPr>
-      </w:pPr>
-      <w:r>
-        <w:rPr>
-          <w:rFonts w:asciiTheme="minorHAnsi" w:hAnsiTheme="minorHAnsi"/>
-        </w:rPr>
-        <w:lastRenderedPageBreak/>
-        <w:t>Orientação e controle da aplicação dos preceitos da Consolidação das Leis do Trabalho, bem como aqueles atinentes à Previdência Social, PIS, FGTS e outros aplicáveis às relações de emprego mantidas pela CONTRATANTE; elaboração de contratos de experiência de empregados; orientação da comunicação ao sindicato de admissão e demissão de empregados; processamento de folha de pagamento e recibo de pagamento; cálculo e recolhimento de FGTS e INSS; elaboração de documentos para homologação de rescisões trabalhistas; elaboração de recibo de férias; emissão de Guia de Contribuição Sindical de Empregado; emissão de comprovante de rendimento de empregado e empregador (“Serviços Trabalhistas”).</w:t>
-      </w:r>
-    </w:p>
-    <w:p>
-      <w:pPr>
-        <w:spacing w:before="80" w:after="80"/>
-        <w:ind w:left="360"/>
-        <w:rPr>
-          <w:rFonts w:asciiTheme="minorHAnsi" w:hAnsiTheme="minorHAnsi"/>
-          <w:b/>
-          <w:bCs/>
-          <w:color w:val="1B3A5C"/>
-        </w:rPr>
-      </w:pPr>
-    </w:p>
-    <w:p>
-      <w:pPr>
-        <w:spacing w:before="80" w:after="80"/>
-        <w:ind w:left="360"/>
-        <w:rPr>
-          <w:rFonts w:asciiTheme="minorHAnsi" w:hAnsiTheme="minorHAnsi"/>
-        </w:rPr>
-      </w:pPr>
-      <w:r>
-        <w:rPr>
-          <w:rFonts w:asciiTheme="minorHAnsi" w:hAnsiTheme="minorHAnsi"/>
-          <w:b/>
-          <w:bCs/>
-          <w:color w:val="2E6DA4"/>
-        </w:rPr>
-        <w:t xml:space="preserve">2.3  </w:t>
-      </w:r>
-      <w:r>
-        <w:rPr>
-          <w:rFonts w:asciiTheme="minorHAnsi" w:hAnsiTheme="minorHAnsi"/>
-          <w:color w:val="1A1A1A"/>
-        </w:rPr>
-        <w:t>Serviços extraordinários — não incluídos no escopo acima — poderão ser contratados separadamente, mediante orçamento prévio aprovado pela CONTRATANTE, por e-mail. São exemplos:</w:t>
-      </w:r>
-    </w:p>
-    <w:p>
-      <w:pPr>
-        <w:spacing w:before="60" w:after="60"/>
-        <w:ind w:left="720" w:hanging="360"/>
-        <w:rPr>
-          <w:rFonts w:asciiTheme="minorHAnsi" w:hAnsiTheme="minorHAnsi"/>
-        </w:rPr>
-      </w:pPr>
-      <w:r>
-        <w:rPr>
-          <w:rFonts w:asciiTheme="minorHAnsi" w:hAnsiTheme="minorHAnsi"/>
-          <w:b/>
-          <w:bCs/>
-          <w:color w:val="E06020"/>
-        </w:rPr>
-        <w:t xml:space="preserve">• </w:t>
-      </w:r>
-      <w:r>
-        <w:rPr>
-          <w:rFonts w:asciiTheme="minorHAnsi" w:hAnsiTheme="minorHAnsi"/>
-          <w:color w:val="1A1A1A"/>
-        </w:rPr>
-        <w:t>Processos paralegais (alteração contratual, abertura de filiais, inscrição estadual em outra UF);</w:t>
-      </w:r>
-    </w:p>
-    <w:p>
-      <w:pPr>
-        <w:spacing w:before="60" w:after="60"/>
-        <w:ind w:left="720" w:hanging="360"/>
-        <w:rPr>
-          <w:rFonts w:asciiTheme="minorHAnsi" w:hAnsiTheme="minorHAnsi"/>
-        </w:rPr>
-      </w:pPr>
-      <w:r>
-        <w:rPr>
-          <w:rFonts w:asciiTheme="minorHAnsi" w:hAnsiTheme="minorHAnsi"/>
-          <w:b/>
-          <w:bCs/>
-          <w:color w:val="E06020"/>
-        </w:rPr>
-        <w:t xml:space="preserve">• </w:t>
-      </w:r>
-      <w:r>
-        <w:rPr>
-          <w:rFonts w:asciiTheme="minorHAnsi" w:hAnsiTheme="minorHAnsi"/>
-          <w:color w:val="1A1A1A"/>
-        </w:rPr>
-        <w:t>Obtenção de certidões negativas (INSS, FGTS, ICMS, ISS) mais de uma vez por mês;</w:t>
-      </w:r>
-    </w:p>
-    <w:p>
-      <w:pPr>
-        <w:spacing w:before="60" w:after="60"/>
-        <w:ind w:left="720" w:hanging="360"/>
-        <w:rPr>
-          <w:rFonts w:asciiTheme="minorHAnsi" w:hAnsiTheme="minorHAnsi"/>
-          <w:color w:val="1A1A1A"/>
-        </w:rPr>
-      </w:pPr>
-      <w:r>
-        <w:rPr>
-          <w:rFonts w:asciiTheme="minorHAnsi" w:hAnsiTheme="minorHAnsi"/>
-          <w:b/>
-          <w:bCs/>
-          <w:color w:val="E06020"/>
-        </w:rPr>
-        <w:t xml:space="preserve">• </w:t>
-      </w:r>
-      <w:r>
-        <w:rPr>
-          <w:rFonts w:asciiTheme="minorHAnsi" w:hAnsiTheme="minorHAnsi"/>
-          <w:color w:val="1A1A1A"/>
-        </w:rPr>
-        <w:t>Certidão negativa de falências ou protestos;</w:t>
-      </w:r>
-    </w:p>
-    <w:p>
-      <w:pPr>
-        <w:spacing w:before="60" w:after="60"/>
-        <w:ind w:left="720" w:hanging="360"/>
-        <w:rPr>
-          <w:rFonts w:asciiTheme="minorHAnsi" w:hAnsiTheme="minorHAnsi"/>
-        </w:rPr>
-      </w:pPr>
-      <w:r>
-        <w:rPr>
-          <w:rFonts w:asciiTheme="minorHAnsi" w:hAnsiTheme="minorHAnsi"/>
-          <w:b/>
-          <w:bCs/>
-          <w:color w:val="E06020"/>
-        </w:rPr>
-        <w:t xml:space="preserve">• </w:t>
-      </w:r>
-      <w:r>
-        <w:rPr>
-          <w:rFonts w:asciiTheme="minorHAnsi" w:hAnsiTheme="minorHAnsi"/>
-          <w:color w:val="1A1A1A"/>
-        </w:rPr>
-        <w:t>Emissão de Notas Fiscais em nome da CONTRATANTE</w:t>
-      </w:r>
-      <w:r>
-        <w:rPr>
-          <w:rFonts w:asciiTheme="minorHAnsi" w:hAnsiTheme="minorHAnsi"/>
-          <w:color w:val="1A1A1A"/>
-        </w:rPr>
-        <w:t>;</w:t>
-      </w:r>
-    </w:p>
-    <w:p>
-      <w:pPr>
-        <w:spacing w:before="60" w:after="60"/>
-        <w:ind w:left="720" w:hanging="360"/>
-        <w:rPr>
-          <w:rFonts w:asciiTheme="minorHAnsi" w:hAnsiTheme="minorHAnsi"/>
-        </w:rPr>
-      </w:pPr>
-      <w:r>
-        <w:rPr>
-          <w:rFonts w:asciiTheme="minorHAnsi" w:hAnsiTheme="minorHAnsi"/>
-          <w:b/>
-          <w:bCs/>
-          <w:color w:val="E06020"/>
-        </w:rPr>
-        <w:t xml:space="preserve">• </w:t>
-      </w:r>
-      <w:r>
-        <w:rPr>
-          <w:rFonts w:asciiTheme="minorHAnsi" w:hAnsiTheme="minorHAnsi"/>
-          <w:color w:val="1A1A1A"/>
-        </w:rPr>
-        <w:t>Preenchimento de fichas cadastrais / IBGE;</w:t>
-      </w:r>
-    </w:p>
-    <w:p>
-      <w:pPr>
-        <w:spacing w:before="60" w:after="60"/>
-        <w:ind w:left="720" w:hanging="360"/>
-        <w:rPr>
-          <w:rFonts w:asciiTheme="minorHAnsi" w:hAnsiTheme="minorHAnsi"/>
-        </w:rPr>
-      </w:pPr>
-      <w:r>
-        <w:rPr>
-          <w:rFonts w:asciiTheme="minorHAnsi" w:hAnsiTheme="minorHAnsi"/>
-          <w:b/>
-          <w:bCs/>
-          <w:color w:val="E06020"/>
-        </w:rPr>
-        <w:t xml:space="preserve">• </w:t>
-      </w:r>
-      <w:r>
-        <w:rPr>
-          <w:rFonts w:asciiTheme="minorHAnsi" w:hAnsiTheme="minorHAnsi"/>
-          <w:color w:val="1A1A1A"/>
-        </w:rPr>
-        <w:t>Reemissão de guias de impostos mais de uma vez por mês;</w:t>
-      </w:r>
-    </w:p>
-    <w:p>
-      <w:pPr>
-        <w:spacing w:before="60" w:after="60"/>
-        <w:ind w:left="720" w:hanging="360"/>
-        <w:rPr>
-          <w:rFonts w:asciiTheme="minorHAnsi" w:hAnsiTheme="minorHAnsi"/>
-        </w:rPr>
-      </w:pPr>
-      <w:r>
-        <w:rPr>
-          <w:rFonts w:asciiTheme="minorHAnsi" w:hAnsiTheme="minorHAnsi"/>
-          <w:b/>
-          <w:bCs/>
-          <w:color w:val="E06020"/>
-        </w:rPr>
-        <w:t xml:space="preserve">• </w:t>
-      </w:r>
-      <w:r>
-        <w:rPr>
-          <w:rFonts w:asciiTheme="minorHAnsi" w:hAnsiTheme="minorHAnsi"/>
-          <w:color w:val="1A1A1A"/>
-        </w:rPr>
-        <w:t>Diligências presenciais em órgãos públicos;</w:t>
-      </w:r>
-    </w:p>
-    <w:p>
-      <w:pPr>
-        <w:spacing w:before="60" w:after="60"/>
-        <w:ind w:left="720" w:hanging="360"/>
-        <w:rPr>
-          <w:rFonts w:asciiTheme="minorHAnsi" w:hAnsiTheme="minorHAnsi"/>
-          <w:color w:val="1A1A1A"/>
-        </w:rPr>
-      </w:pPr>
-      <w:r>
-        <w:rPr>
-          <w:rFonts w:asciiTheme="minorHAnsi" w:hAnsiTheme="minorHAnsi"/>
-          <w:b/>
-          <w:bCs/>
-          <w:color w:val="E06020"/>
-        </w:rPr>
-        <w:t xml:space="preserve">• </w:t>
-      </w:r>
-      <w:r>
-        <w:rPr>
-          <w:rFonts w:asciiTheme="minorHAnsi" w:hAnsiTheme="minorHAnsi"/>
-          <w:color w:val="1A1A1A"/>
-        </w:rPr>
-        <w:t>Cálculo, emissão e recebimento de RPA</w:t>
-      </w:r>
-      <w:r>
-        <w:rPr>
-          <w:rFonts w:asciiTheme="minorHAnsi" w:hAnsiTheme="minorHAnsi"/>
-          <w:color w:val="1A1A1A"/>
-        </w:rPr>
-        <w:t>;</w:t>
-      </w:r>
-    </w:p>
-    <w:p>
-      <w:pPr>
-        <w:spacing w:before="60" w:after="60"/>
-        <w:ind w:left="720" w:hanging="360"/>
-        <w:rPr>
-          <w:rFonts w:asciiTheme="minorHAnsi" w:hAnsiTheme="minorHAnsi"/>
-          <w:color w:val="1A1A1A"/>
-        </w:rPr>
-      </w:pPr>
-      <w:r>
-        <w:rPr>
-          <w:rFonts w:asciiTheme="minorHAnsi" w:hAnsiTheme="minorHAnsi"/>
-          <w:b/>
-          <w:bCs/>
-          <w:color w:val="E06020"/>
-        </w:rPr>
-        <w:t>•</w:t>
-      </w:r>
-      <w:r>
-        <w:rPr>
-          <w:rFonts w:asciiTheme="minorHAnsi" w:hAnsiTheme="minorHAnsi"/>
-          <w:b/>
-          <w:bCs/>
-          <w:color w:val="E06020"/>
-        </w:rPr>
-        <w:t xml:space="preserve"> </w:t>
-      </w:r>
-      <w:r>
-        <w:rPr>
-          <w:rFonts w:asciiTheme="minorHAnsi" w:hAnsiTheme="minorHAnsi"/>
-          <w:color w:val="1A1A1A"/>
-        </w:rPr>
-        <w:t>Simulação de Preço de produtos e serviços;</w:t>
-      </w:r>
-    </w:p>
-    <w:p>
-      <w:pPr>
-        <w:spacing w:before="60" w:after="60"/>
-        <w:ind w:left="720" w:hanging="360"/>
-        <w:rPr>
-          <w:rFonts w:asciiTheme="minorHAnsi" w:hAnsiTheme="minorHAnsi"/>
-        </w:rPr>
-      </w:pPr>
-      <w:r>
-        <w:rPr>
-          <w:rFonts w:asciiTheme="minorHAnsi" w:hAnsiTheme="minorHAnsi"/>
-          <w:b/>
-          <w:bCs/>
-          <w:color w:val="E06020"/>
-        </w:rPr>
-        <w:t>•</w:t>
-      </w:r>
-      <w:r>
-        <w:rPr>
-          <w:rFonts w:asciiTheme="minorHAnsi" w:hAnsiTheme="minorHAnsi"/>
-          <w:b/>
-          <w:bCs/>
-          <w:color w:val="E06020"/>
-        </w:rPr>
-        <w:t xml:space="preserve"> </w:t>
-      </w:r>
-      <w:r>
-        <w:rPr>
-          <w:rFonts w:asciiTheme="minorHAnsi" w:hAnsiTheme="minorHAnsi"/>
-          <w:color w:val="1A1A1A"/>
-        </w:rPr>
-        <w:t xml:space="preserve">Simulação de </w:t>
-      </w:r>
-      <w:r>
-        <w:rPr>
-          <w:rFonts w:asciiTheme="minorHAnsi" w:hAnsiTheme="minorHAnsi"/>
-          <w:color w:val="1A1A1A"/>
-        </w:rPr>
-        <w:t>tributária para o Lucro Real</w:t>
-      </w:r>
-      <w:r>
-        <w:rPr>
-          <w:rFonts w:asciiTheme="minorHAnsi" w:hAnsiTheme="minorHAnsi"/>
-          <w:color w:val="1A1A1A"/>
-        </w:rPr>
-        <w:t>;</w:t>
-      </w:r>
-    </w:p>
-    <w:p>
-      <w:pPr>
-        <w:spacing w:before="60" w:after="60"/>
-        <w:ind w:left="720" w:hanging="360"/>
-        <w:rPr>
-          <w:rFonts w:asciiTheme="minorHAnsi" w:hAnsiTheme="minorHAnsi"/>
-          <w:color w:val="1A1A1A"/>
-        </w:rPr>
-      </w:pPr>
-      <w:r>
-        <w:rPr>
-          <w:rFonts w:asciiTheme="minorHAnsi" w:hAnsiTheme="minorHAnsi"/>
-          <w:b/>
-          <w:bCs/>
-          <w:color w:val="E06020"/>
-        </w:rPr>
-        <w:t>•</w:t>
-      </w:r>
-      <w:r>
-        <w:rPr>
-          <w:rFonts w:asciiTheme="minorHAnsi" w:hAnsiTheme="minorHAnsi"/>
-          <w:b/>
-          <w:bCs/>
-          <w:color w:val="E06020"/>
-        </w:rPr>
-        <w:t xml:space="preserve"> </w:t>
-      </w:r>
-      <w:r>
-        <w:rPr>
-          <w:rFonts w:asciiTheme="minorHAnsi" w:hAnsiTheme="minorHAnsi"/>
-          <w:color w:val="1A1A1A"/>
-        </w:rPr>
-        <w:t>Atendimento de malhas fiscais de períodos anteriores à vigência do contrato</w:t>
-      </w:r>
-      <w:r>
-        <w:rPr>
-          <w:rFonts w:asciiTheme="minorHAnsi" w:hAnsiTheme="minorHAnsi"/>
-          <w:color w:val="1A1A1A"/>
-        </w:rPr>
-        <w:t>;</w:t>
-      </w:r>
-    </w:p>
-    <w:p>
-      <w:pPr>
-        <w:spacing w:before="60" w:after="60"/>
-        <w:ind w:left="720" w:hanging="360"/>
-        <w:rPr>
-          <w:rFonts w:asciiTheme="minorHAnsi" w:hAnsiTheme="minorHAnsi"/>
-        </w:rPr>
-      </w:pPr>
-    </w:p>
-    <w:p>
-      <w:pPr>
-        <w:spacing w:before="80" w:after="80"/>
-        <w:ind w:left="360"/>
-        <w:rPr>
-          <w:rFonts w:asciiTheme="minorHAnsi" w:hAnsiTheme="minorHAnsi"/>
-        </w:rPr>
-      </w:pPr>
-      <w:r>
-        <w:rPr>
-          <w:rFonts w:asciiTheme="minorHAnsi" w:hAnsiTheme="minorHAnsi"/>
           <w:b/>
           <w:bCs/>
           <w:color w:val="2E6DA4"/>
@@ -2101,7 +1668,7 @@
         <w:t>O escopo dos serviços restringe-se ao expressamente previsto na Cláusula 2.2. Serviços não expressamente incluídos consideram-se extraordinários, ainda que conexos ou habituais no mercado, dependendo de orçamento prévio aprovado. A lista da Cláusula 2.3 é exemplificativa, não exaustiva.</w:t>
       </w:r>
     </w:p>
-    <w:p>
+    <w:p ns2:paraId="33EA2C8D" ns2:textId="77777777">
       <w:pPr>
         <w:spacing w:before="80"/>
         <w:rPr>
@@ -2109,7 +1676,7 @@
         </w:rPr>
       </w:pPr>
     </w:p>
-    <w:p>
+    <w:p ns2:paraId="39BBEBF9" ns2:textId="77777777">
       <w:pPr>
         <w:pBdr>
           <w:bottom w:val="single" w:sz="6" w:space="4" w:color="E06020"/>
@@ -2131,7 +1698,7 @@
         <w:t>3. VIGÊNCIA</w:t>
       </w:r>
     </w:p>
-    <w:p>
+    <w:p ns2:paraId="7958859F" ns2:textId="3000477B">
       <w:pPr>
         <w:spacing w:before="80" w:after="80"/>
         <w:ind w:left="360"/>
@@ -2140,71 +1707,10 @@
         </w:rPr>
       </w:pPr>
       <w:r>
-        <w:rPr>
-          <w:rFonts w:asciiTheme="minorHAnsi" w:hAnsiTheme="minorHAnsi"/>
-          <w:b/>
-          <w:bCs/>
-          <w:color w:val="2E6DA4"/>
-        </w:rPr>
-        <w:t xml:space="preserve">3.1  </w:t>
-      </w:r>
-      <w:r>
-        <w:rPr>
-          <w:rFonts w:asciiTheme="minorHAnsi" w:hAnsiTheme="minorHAnsi"/>
-          <w:color w:val="1A1A1A"/>
-        </w:rPr>
-        <w:t xml:space="preserve">Este Contrato entra em vigor em </w:t>
-      </w:r>
-      <w:r>
-        <w:rPr>
-          <w:rFonts w:asciiTheme="minorHAnsi" w:hAnsiTheme="minorHAnsi"/>
-          <w:b/>
-          <w:bCs/>
-          <w:color w:val="1A1A1A"/>
-        </w:rPr>
-        <w:t>01/07/2026</w:t>
-      </w:r>
-      <w:r>
-        <w:rPr>
-          <w:rFonts w:asciiTheme="minorHAnsi" w:hAnsiTheme="minorHAnsi"/>
-          <w:color w:val="1A1A1A"/>
-        </w:rPr>
-        <w:t xml:space="preserve"> e tem duração de </w:t>
-      </w:r>
-      <w:r>
-        <w:rPr>
-          <w:rFonts w:asciiTheme="minorHAnsi" w:hAnsiTheme="minorHAnsi"/>
-          <w:b/>
-          <w:bCs/>
-          <w:color w:val="1A1A1A"/>
-        </w:rPr>
-        <w:t>12 (doze) meses</w:t>
-      </w:r>
-      <w:r>
-        <w:rPr>
-          <w:rFonts w:asciiTheme="minorHAnsi" w:hAnsiTheme="minorHAnsi"/>
-          <w:color w:val="1A1A1A"/>
-        </w:rPr>
-        <w:t xml:space="preserve">, renovando-se automaticamente por períodos iguais. Qualquer parte pode rescindi-lo mediante aviso prévio de </w:t>
-      </w:r>
-      <w:r>
-        <w:rPr>
-          <w:rFonts w:asciiTheme="minorHAnsi" w:hAnsiTheme="minorHAnsi"/>
-          <w:b/>
-          <w:bCs/>
-          <w:color w:val="1A1A1A"/>
-        </w:rPr>
-        <w:t>60 (sessenta) dias</w:t>
-      </w:r>
-      <w:r>
-        <w:rPr>
-          <w:rFonts w:asciiTheme="minorHAnsi" w:hAnsiTheme="minorHAnsi"/>
-          <w:color w:val="1A1A1A"/>
-        </w:rPr>
-        <w:t xml:space="preserve"> por e-mail para info@valore.com.br. Todos os pagamentos vencidos até a rescisão efetiva permanecem devidos.</w:t>
-      </w:r>
-    </w:p>
-    <w:p>
+        <w:t xml:space="preserve">{{ texto_vigencia_clausula }}</w:t>
+      </w:r>
+    </w:p>
+    <w:p ns2:paraId="512D2057" ns2:textId="090903C8">
       <w:pPr>
         <w:spacing w:before="80" w:after="80"/>
         <w:ind w:left="360"/>
@@ -2246,7 +1752,7 @@
         <w:t xml:space="preserve"> pelo valor vigente à época.</w:t>
       </w:r>
     </w:p>
-    <w:p>
+    <w:p ns2:paraId="26767CCF" ns2:textId="73A80C90">
       <w:pPr>
         <w:spacing w:before="80" w:after="80"/>
         <w:ind w:left="360"/>
@@ -2289,7 +1795,7 @@
         <w:t>Qualquer das Partes poderá rescindir este Contrato de imediato, sem aviso prévio e sem a multa da Cláusula 3.2, em caso de: (i) inadimplência superior a [90] dias; (ii) fraude, falsidade documental ou recusa da CONTRATANTE em regularizar operações em desacordo com a lei; (iii) descumprimento grave de obrigação contratual não sanado em [15] dias após notificação escrita.</w:t>
       </w:r>
     </w:p>
-    <w:p>
+    <w:p ns2:paraId="7BCA99AD" ns2:textId="1B54FE83">
       <w:pPr>
         <w:rPr>
           <w:rFonts w:asciiTheme="minorHAnsi" w:hAnsiTheme="minorHAnsi"/>
@@ -2302,7 +1808,7 @@
         <w:br w:type="page"/>
       </w:r>
     </w:p>
-    <w:p>
+    <w:p ns2:paraId="4B3E785B" ns2:textId="77777777">
       <w:pPr>
         <w:pBdr>
           <w:bottom w:val="single" w:sz="6" w:space="4" w:color="E06020"/>
@@ -2325,7 +1831,7 @@
         <w:t>4. VALORES E PAGAMENTO</w:t>
       </w:r>
     </w:p>
-    <w:p>
+    <w:p ns2:paraId="369C113A" ns2:textId="22268AF1">
       <w:pPr>
         <w:spacing w:before="80" w:after="80"/>
         <w:ind w:left="360"/>
@@ -2334,78 +1840,10 @@
         </w:rPr>
       </w:pPr>
       <w:r>
-        <w:rPr>
-          <w:rFonts w:asciiTheme="minorHAnsi" w:hAnsiTheme="minorHAnsi"/>
-          <w:b/>
-          <w:bCs/>
-          <w:color w:val="2E6DA4"/>
-        </w:rPr>
-        <w:t xml:space="preserve">4.1  </w:t>
-      </w:r>
-      <w:r>
-        <w:rPr>
-          <w:rFonts w:asciiTheme="minorHAnsi" w:hAnsiTheme="minorHAnsi"/>
-          <w:color w:val="1A1A1A"/>
-        </w:rPr>
-        <w:t xml:space="preserve">Os honorários mensais são de </w:t>
-      </w:r>
-      <w:r>
-        <w:rPr>
-          <w:rFonts w:asciiTheme="minorHAnsi" w:hAnsiTheme="minorHAnsi"/>
-          <w:b/>
-          <w:bCs/>
-          <w:color w:val="1A1A1A"/>
-        </w:rPr>
-        <w:t xml:space="preserve">R$ </w:t>
-      </w:r>
-      <w:r>
-        <w:rPr>
-          <w:b/>
-          <w:bCs/>
-          <w:sz w:val="20"/>
-          <w:szCs w:val="20"/>
-        </w:rPr>
-        <w:t>22.694,00</w:t>
-      </w:r>
-      <w:r>
-        <w:rPr>
-          <w:rFonts w:asciiTheme="minorHAnsi" w:hAnsiTheme="minorHAnsi"/>
-          <w:color w:val="1A1A1A"/>
-        </w:rPr>
-        <w:t xml:space="preserve">, com vencimento no dia </w:t>
-      </w:r>
-      <w:r>
-        <w:rPr>
-          <w:rFonts w:asciiTheme="minorHAnsi" w:hAnsiTheme="minorHAnsi"/>
-          <w:b/>
-          <w:bCs/>
-          <w:color w:val="1A1A1A"/>
-        </w:rPr>
-        <w:t>25</w:t>
-      </w:r>
-      <w:r>
-        <w:rPr>
-          <w:rFonts w:asciiTheme="minorHAnsi" w:hAnsiTheme="minorHAnsi"/>
-          <w:color w:val="1A1A1A"/>
-        </w:rPr>
-        <w:t xml:space="preserve"> de </w:t>
-      </w:r>
-      <w:r>
-        <w:rPr>
-          <w:rFonts w:asciiTheme="minorHAnsi" w:hAnsiTheme="minorHAnsi"/>
-          <w:color w:val="1A1A1A"/>
-        </w:rPr>
-        <w:t>cada mês</w:t>
-      </w:r>
-      <w:r>
-        <w:rPr>
-          <w:rFonts w:asciiTheme="minorHAnsi" w:hAnsiTheme="minorHAnsi"/>
-          <w:color w:val="1A1A1A"/>
-        </w:rPr>
-        <w:t>, via boleto bancário.</w:t>
-      </w:r>
-    </w:p>
-    <w:p>
+        <w:t xml:space="preserve">{{ texto_clausula_4_1 }}</w:t>
+      </w:r>
+    </w:p>
+    <w:p ns2:paraId="1C4DB391" ns2:textId="253CB08B">
       <w:pPr>
         <w:spacing w:before="80" w:after="80"/>
         <w:ind w:left="360"/>
@@ -2414,67 +1852,10 @@
         </w:rPr>
       </w:pPr>
       <w:r>
-        <w:rPr>
-          <w:rFonts w:asciiTheme="minorHAnsi" w:hAnsiTheme="minorHAnsi"/>
-          <w:b/>
-          <w:bCs/>
-          <w:color w:val="2E6DA4"/>
-        </w:rPr>
-        <w:t xml:space="preserve">4.2  </w:t>
-      </w:r>
-      <w:r>
-        <w:rPr>
-          <w:rFonts w:asciiTheme="minorHAnsi" w:hAnsiTheme="minorHAnsi"/>
-          <w:color w:val="1A1A1A"/>
-        </w:rPr>
-        <w:t xml:space="preserve">Os honorários serão </w:t>
-      </w:r>
-      <w:r>
-        <w:rPr>
-          <w:rFonts w:asciiTheme="minorHAnsi" w:hAnsiTheme="minorHAnsi"/>
-          <w:b/>
-          <w:bCs/>
-          <w:color w:val="1A1A1A"/>
-        </w:rPr>
-        <w:t>reajustados anualmente</w:t>
-      </w:r>
-      <w:r>
-        <w:rPr>
-          <w:rFonts w:asciiTheme="minorHAnsi" w:hAnsiTheme="minorHAnsi"/>
-          <w:color w:val="1A1A1A"/>
-        </w:rPr>
-        <w:t xml:space="preserve"> pela atualização do salário-mínimo ou</w:t>
-      </w:r>
-      <w:r>
-        <w:rPr>
-          <w:rFonts w:asciiTheme="minorHAnsi" w:hAnsiTheme="minorHAnsi"/>
-          <w:color w:val="1A1A1A"/>
-        </w:rPr>
-        <w:t>, em sua ausência,</w:t>
-      </w:r>
-      <w:r>
-        <w:rPr>
-          <w:rFonts w:asciiTheme="minorHAnsi" w:hAnsiTheme="minorHAnsi"/>
-          <w:color w:val="1A1A1A"/>
-        </w:rPr>
-        <w:t xml:space="preserve"> </w:t>
-      </w:r>
-      <w:r>
-        <w:rPr>
-          <w:rFonts w:asciiTheme="minorHAnsi" w:hAnsiTheme="minorHAnsi"/>
-          <w:color w:val="1A1A1A"/>
-        </w:rPr>
-        <w:t>IPCA ou IGP-M</w:t>
-      </w:r>
-      <w:r>
-        <w:rPr>
-          <w:rFonts w:asciiTheme="minorHAnsi" w:hAnsiTheme="minorHAnsi"/>
-          <w:color w:val="1A1A1A"/>
-        </w:rPr>
-        <w:t>.</w:t>
-      </w:r>
-    </w:p>
-    <w:p>
+        <w:t xml:space="preserve">{{ texto_clausula_4_2 }}</w:t>
+      </w:r>
+    </w:p>
+    <w:p ns2:paraId="6BEE7ED1" ns2:textId="77777777">
       <w:pPr>
         <w:spacing w:before="80" w:after="80"/>
         <w:ind w:left="360"/>
@@ -2515,7 +1896,7 @@
         <w:t xml:space="preserve"> da CONTRATANTE não rescinde o Contrato nem suspende a obrigação de pagamento, pois a CONTRATADA mantém obrigações perante órgãos públicos. Para encerrar os serviços, aplica-se o disposto na Cláusula 3.</w:t>
       </w:r>
     </w:p>
-    <w:p>
+    <w:p ns2:paraId="3783FA28" ns2:textId="77777777">
       <w:pPr>
         <w:spacing w:before="80" w:after="80"/>
         <w:ind w:left="360"/>
@@ -2556,7 +1937,7 @@
         <w:t>, mediante comprovante e aprovação prévia.</w:t>
       </w:r>
     </w:p>
-    <w:p>
+    <w:p ns2:paraId="5D20AF77" ns2:textId="77777777">
       <w:pPr>
         <w:spacing w:before="80" w:after="80"/>
         <w:ind w:left="360"/>
@@ -2613,7 +1994,7 @@
         <w:t>.</w:t>
       </w:r>
     </w:p>
-    <w:p>
+    <w:p ns2:paraId="49F84764" ns2:textId="774BE487">
       <w:pPr>
         <w:spacing w:before="80" w:after="80"/>
         <w:ind w:left="360"/>
@@ -2622,96 +2003,10 @@
         </w:rPr>
       </w:pPr>
       <w:r>
-        <w:rPr>
-          <w:rFonts w:asciiTheme="minorHAnsi" w:hAnsiTheme="minorHAnsi"/>
-          <w:b/>
-          <w:bCs/>
-          <w:color w:val="2E6DA4"/>
-        </w:rPr>
-        <w:t xml:space="preserve">4.6  </w:t>
-      </w:r>
-      <w:r>
-        <w:rPr>
-          <w:rFonts w:asciiTheme="minorHAnsi" w:hAnsiTheme="minorHAnsi"/>
-          <w:color w:val="1A1A1A"/>
-        </w:rPr>
-        <w:fldChar w:fldCharType="begin"/>
-      </w:r>
-      <w:r>
-        <w:rPr>
-          <w:rFonts w:asciiTheme="minorHAnsi" w:hAnsiTheme="minorHAnsi"/>
-          <w:color w:val="1A1A1A"/>
-        </w:rPr>
-        <w:instrText xml:space="preserve"> MERGEFIELD M_13ª_Parcela </w:instrText>
-      </w:r>
-      <w:r>
-        <w:rPr>
-          <w:rFonts w:asciiTheme="minorHAnsi" w:hAnsiTheme="minorHAnsi"/>
-          <w:color w:val="1A1A1A"/>
-        </w:rPr>
-        <w:fldChar w:fldCharType="separate"/>
-      </w:r>
-      <w:r>
-        <w:rPr>
-          <w:rFonts w:asciiTheme="minorHAnsi" w:hAnsiTheme="minorHAnsi"/>
-          <w:noProof/>
-          <w:color w:val="1A1A1A"/>
-        </w:rPr>
-        <w:t>«M_</w:t>
-      </w:r>
-      <w:r>
-        <w:rPr>
-          <w:rFonts w:asciiTheme="minorHAnsi" w:hAnsiTheme="minorHAnsi"/>
-          <w:noProof/>
-          <w:color w:val="1A1A1A"/>
-        </w:rPr>
-        <w:t>Adicional</w:t>
-      </w:r>
-      <w:r>
-        <w:rPr>
-          <w:rFonts w:asciiTheme="minorHAnsi" w:hAnsiTheme="minorHAnsi"/>
-          <w:noProof/>
-          <w:color w:val="1A1A1A"/>
-        </w:rPr>
-        <w:t>_Parcela»</w:t>
-      </w:r>
-      <w:r>
-        <w:rPr>
-          <w:rFonts w:asciiTheme="minorHAnsi" w:hAnsiTheme="minorHAnsi"/>
-          <w:color w:val="1A1A1A"/>
-        </w:rPr>
-        <w:fldChar w:fldCharType="end"/>
-      </w:r>
-      <w:r>
-        <w:rPr>
-          <w:rFonts w:asciiTheme="minorHAnsi" w:hAnsiTheme="minorHAnsi"/>
-          <w:color w:val="1A1A1A"/>
-        </w:rPr>
-        <w:t xml:space="preserve"> </w:t>
-      </w:r>
-      <w:r>
-        <w:rPr>
-          <w:rFonts w:asciiTheme="minorHAnsi" w:hAnsiTheme="minorHAnsi"/>
-          <w:color w:val="1A1A1A"/>
-        </w:rPr>
-        <w:t>(</w:t>
-      </w:r>
-      <w:r>
-        <w:rPr>
-          <w:rFonts w:asciiTheme="minorHAnsi" w:hAnsiTheme="minorHAnsi"/>
-          <w:color w:val="1A1A1A"/>
-        </w:rPr>
-        <w:t>encerramento das demonstrações contábeis anuais, Declaração de Rendimentos da Pessoa Jurídica, Declaração de Movimento Fiscal Estadual (inventário anual), transmissão da Escrituração Contábil Digital (ECD), transmissão da Escrituração Contábil Fiscal (ECF) e atendimento à Declaração Anual de Incentivos Fiscais administrados pela SUDENE (DAIF</w:t>
-      </w:r>
-      <w:r>
-        <w:rPr>
-          <w:rFonts w:asciiTheme="minorHAnsi" w:hAnsiTheme="minorHAnsi"/>
-          <w:color w:val="1A1A1A"/>
-        </w:rPr>
-        <w:t>).</w:t>
-      </w:r>
-    </w:p>
-    <w:p>
+        <w:t xml:space="preserve">{% if exibir_clausula_decima_terceira %}{{ texto_decima_terceira_parcela }}{% endif %}</w:t>
+      </w:r>
+    </w:p>
+    <w:p ns2:paraId="54D79507" ns2:textId="77777777">
       <w:pPr>
         <w:spacing w:before="80" w:after="80"/>
         <w:ind w:left="360"/>
@@ -2737,7 +2032,7 @@
         <w:t>Revisão extraordinária de honorários poderá ocorrer em comum acordo, se houver aumento comprovado do escopo (ver Anexo I).</w:t>
       </w:r>
     </w:p>
-    <w:p>
+    <w:p ns2:paraId="4980BECC" ns2:textId="74C726BA">
       <w:pPr>
         <w:spacing w:before="80" w:after="80"/>
         <w:ind w:left="360"/>
@@ -2781,7 +2076,7 @@
         <w:t>Uma parcela no valor da cláusula 3.1 é prevista na assinatura do contrato para implementação do projeto, englobando revisão fiscal inicial, análise dos demonstrativos contábeis recebidos, reunião de início de trabalho e apresentação/treinamento inicial com o time financeiro.</w:t>
       </w:r>
     </w:p>
-    <w:p>
+    <w:p ns2:paraId="5724B0BB" ns2:textId="77777777">
       <w:pPr>
         <w:spacing w:before="80"/>
         <w:rPr>
@@ -2789,7 +2084,7 @@
         </w:rPr>
       </w:pPr>
     </w:p>
-    <w:p>
+    <w:p ns2:paraId="359CD684" ns2:textId="77777777">
       <w:pPr>
         <w:pBdr>
           <w:bottom w:val="single" w:sz="6" w:space="4" w:color="E06020"/>
@@ -2811,7 +2106,7 @@
         <w:t>5. OBRIGAÇÕES DA CONTRATADA</w:t>
       </w:r>
     </w:p>
-    <w:p>
+    <w:p ns2:paraId="5CDE64F6" ns2:textId="77777777">
       <w:pPr>
         <w:spacing w:before="80" w:after="80"/>
         <w:ind w:left="360"/>
@@ -2836,7 +2131,7 @@
         <w:t>Prestar os serviços da Cláusula 2 com zelo e diligência.</w:t>
       </w:r>
     </w:p>
-    <w:p>
+    <w:p ns2:paraId="5AD4177E" ns2:textId="77777777">
       <w:pPr>
         <w:spacing w:before="80" w:after="80"/>
         <w:ind w:left="360"/>
@@ -2877,7 +2172,7 @@
         <w:t xml:space="preserve"> a demandas fora do prazo normal ou não recorrentes. Em casos de inadimplência com pagamento urgente, o prazo será minimizado.</w:t>
       </w:r>
     </w:p>
-    <w:p>
+    <w:p ns2:paraId="15962CB8" ns2:textId="77777777">
       <w:pPr>
         <w:spacing w:before="80" w:after="80"/>
         <w:ind w:left="360"/>
@@ -2919,7 +2214,7 @@
         <w:t xml:space="preserve"> de todas as informações financeiras, contábeis, fiscais e estratégicas da CONTRATANTE.</w:t>
       </w:r>
     </w:p>
-    <w:p>
+    <w:p ns2:paraId="42A9D284" ns2:textId="34C36C04">
       <w:pPr>
         <w:spacing w:before="80" w:after="80"/>
         <w:ind w:left="360"/>
@@ -2963,7 +2258,7 @@
         <w:t>Os prazos da CONTRATADA ficam suspensos durante indisponibilidade, instabilidade ou atraso dos sistemas públicos necessários à execução dos serviços (SEFAZ, e-CAC, portais municipais, ambiente nacional da NFS-e e congêneres), retomando-se pelo saldo remanescente quando restabelecidos, sem caracterizar inadimplemento.</w:t>
       </w:r>
     </w:p>
-    <w:p>
+    <w:p ns2:paraId="63F4772A" ns2:textId="77777777">
       <w:pPr>
         <w:spacing w:before="80" w:after="80"/>
         <w:ind w:left="360"/>
@@ -2972,7 +2267,7 @@
         </w:rPr>
       </w:pPr>
     </w:p>
-    <w:p>
+    <w:p ns2:paraId="3D3E508E" ns2:textId="77777777">
       <w:pPr>
         <w:pBdr>
           <w:bottom w:val="single" w:sz="6" w:space="4" w:color="E06020"/>
@@ -2994,7 +2289,7 @@
         <w:t>6. OBRIGAÇÕES DA CONTRATANTE</w:t>
       </w:r>
     </w:p>
-    <w:p>
+    <w:p ns2:paraId="1AA53CE4" ns2:textId="77777777">
       <w:pPr>
         <w:spacing w:before="80" w:after="80"/>
         <w:ind w:left="360"/>
@@ -3035,7 +2330,7 @@
         <w:t xml:space="preserve"> da assinatura.</w:t>
       </w:r>
     </w:p>
-    <w:p>
+    <w:p ns2:paraId="501DC07B" ns2:textId="3CFF7E7C">
       <w:pPr>
         <w:spacing w:before="80" w:after="80"/>
         <w:ind w:left="360"/>
@@ -3106,7 +2401,7 @@
         <w:t>:</w:t>
       </w:r>
     </w:p>
-    <w:p>
+    <w:p ns2:paraId="206E1DBB" ns2:textId="649FC741">
       <w:pPr>
         <w:spacing w:before="60" w:after="60"/>
         <w:ind w:left="720" w:hanging="360"/>
@@ -3167,7 +2462,7 @@
         <w:t>);</w:t>
       </w:r>
     </w:p>
-    <w:p>
+    <w:p ns2:paraId="1CA4AC27" ns2:textId="46D6E441">
       <w:pPr>
         <w:spacing w:before="60" w:after="60"/>
         <w:ind w:left="720" w:hanging="360"/>
@@ -3255,7 +2550,7 @@
         <w:t>;</w:t>
       </w:r>
     </w:p>
-    <w:p>
+    <w:p ns2:paraId="3B7749C1" ns2:textId="361E0D24">
       <w:pPr>
         <w:spacing w:before="60" w:after="60"/>
         <w:ind w:left="720" w:hanging="360"/>
@@ -3294,7 +2589,7 @@
         <w:t xml:space="preserve"> (formato Excel e OFX);</w:t>
       </w:r>
     </w:p>
-    <w:p>
+    <w:p ns2:paraId="6A553B24" ns2:textId="424EF4A1">
       <w:pPr>
         <w:spacing w:before="60" w:after="60"/>
         <w:ind w:left="720" w:hanging="360"/>
@@ -3328,7 +2623,7 @@
         <w:t>.</w:t>
       </w:r>
     </w:p>
-    <w:p>
+    <w:p ns2:paraId="6F52C501" ns2:textId="635F9B1F">
       <w:pPr>
         <w:spacing w:before="60" w:after="60"/>
         <w:ind w:left="720" w:hanging="360"/>
@@ -3353,7 +2648,7 @@
         <w:t>Arquivo em excel com a composição do saldo de Contas a Receber por nota fiscal/fatura com vencimento e valor;</w:t>
       </w:r>
     </w:p>
-    <w:p>
+    <w:p ns2:paraId="555CB34B" ns2:textId="31AA105F">
       <w:pPr>
         <w:spacing w:before="60" w:after="60"/>
         <w:ind w:left="720" w:hanging="360"/>
@@ -3378,7 +2673,7 @@
         <w:t>Arquivo em excel com a composição do saldo de Contas a Pagar por nota fiscal/fatura com vencimento e valor;</w:t>
       </w:r>
     </w:p>
-    <w:p>
+    <w:p ns2:paraId="493E1FB2" ns2:textId="688F41FF">
       <w:pPr>
         <w:spacing w:before="60" w:after="60"/>
         <w:ind w:left="1428" w:hanging="12"/>
@@ -3433,7 +2728,7 @@
         <w:t xml:space="preserve"> </w:t>
       </w:r>
     </w:p>
-    <w:p>
+    <w:p ns2:paraId="62CABF99" ns2:textId="09D04856">
       <w:pPr>
         <w:spacing w:before="80" w:after="80"/>
         <w:ind w:left="360"/>
@@ -3486,7 +2781,7 @@
         <w:t>.</w:t>
       </w:r>
     </w:p>
-    <w:p>
+    <w:p ns2:paraId="17254386" ns2:textId="77777777">
       <w:pPr>
         <w:spacing w:before="80" w:after="80"/>
         <w:ind w:left="360"/>
@@ -3511,7 +2806,7 @@
         <w:t>Responsabilizar-se pelo correto arquivamento de documentos, notas fiscais e comprovantes.</w:t>
       </w:r>
     </w:p>
-    <w:p>
+    <w:p ns2:paraId="0B9C3796" ns2:textId="77777777">
       <w:pPr>
         <w:spacing w:before="80" w:after="80"/>
         <w:ind w:left="360"/>
@@ -3536,7 +2831,7 @@
         <w:t>Informar mensalmente pagamentos recebidos, impostos pagos e notas emitidas.</w:t>
       </w:r>
     </w:p>
-    <w:p>
+    <w:p ns2:paraId="030D290C" ns2:textId="77777777">
       <w:pPr>
         <w:spacing w:before="80" w:after="80"/>
         <w:ind w:left="360"/>
@@ -3561,7 +2856,7 @@
         <w:t>Fornecer Carta de Responsabilidade da Administração ao final de cada exercício social.</w:t>
       </w:r>
     </w:p>
-    <w:p>
+    <w:p ns2:paraId="2AEC63A3" ns2:textId="77777777">
       <w:pPr>
         <w:spacing w:before="80" w:after="80"/>
         <w:ind w:left="360"/>
@@ -3586,7 +2881,7 @@
         <w:t>Adquirir certificado digital A1 (CNPJ), caso não possua.</w:t>
       </w:r>
     </w:p>
-    <w:p>
+    <w:p ns2:paraId="49B7397C" ns2:textId="77777777">
       <w:pPr>
         <w:spacing w:before="80" w:after="80"/>
         <w:ind w:left="360"/>
@@ -3611,7 +2906,7 @@
         <w:t>Em caso de pendências anteriores ao início do Contrato, a CONTRATADA poderá cobrar valores adicionais, mediante orçamento prévio aprovado.</w:t>
       </w:r>
     </w:p>
-    <w:p>
+    <w:p ns2:paraId="15252FA7" ns2:textId="77777777">
       <w:pPr>
         <w:spacing w:before="80" w:after="80"/>
         <w:ind w:left="360"/>
@@ -3621,55 +2916,10 @@
         </w:rPr>
       </w:pPr>
       <w:r>
-        <w:rPr>
-          <w:rFonts w:asciiTheme="minorHAnsi" w:hAnsiTheme="minorHAnsi"/>
-          <w:b/>
-          <w:bCs/>
-          <w:color w:val="2E6DA4"/>
-        </w:rPr>
-        <w:t xml:space="preserve">6.9  </w:t>
-      </w:r>
-      <w:r>
-        <w:rPr>
-          <w:rFonts w:asciiTheme="minorHAnsi" w:hAnsiTheme="minorHAnsi"/>
-          <w:color w:val="1A1A1A"/>
-        </w:rPr>
-        <w:t xml:space="preserve">A inadimplência de </w:t>
-      </w:r>
-      <w:r>
-        <w:rPr>
-          <w:rFonts w:asciiTheme="minorHAnsi" w:hAnsiTheme="minorHAnsi"/>
-          <w:b/>
-          <w:bCs/>
-          <w:color w:val="1A1A1A"/>
-        </w:rPr>
-        <w:t>2 ou mais parcelas</w:t>
-      </w:r>
-      <w:r>
-        <w:rPr>
-          <w:rFonts w:asciiTheme="minorHAnsi" w:hAnsiTheme="minorHAnsi"/>
-          <w:color w:val="1A1A1A"/>
-        </w:rPr>
-        <w:t xml:space="preserve"> autoriza a CONTRATADA a </w:t>
-      </w:r>
-      <w:r>
-        <w:rPr>
-          <w:rFonts w:asciiTheme="minorHAnsi" w:hAnsiTheme="minorHAnsi"/>
-          <w:b/>
-          <w:bCs/>
-          <w:color w:val="1A1A1A"/>
-        </w:rPr>
-        <w:t>suspender os serviços</w:t>
-      </w:r>
-      <w:r>
-        <w:rPr>
-          <w:rFonts w:asciiTheme="minorHAnsi" w:hAnsiTheme="minorHAnsi"/>
-          <w:color w:val="1A1A1A"/>
-        </w:rPr>
-        <w:t xml:space="preserve"> até quitação integral.</w:t>
-      </w:r>
-    </w:p>
-    <w:p>
+        <w:t xml:space="preserve">{{ texto_suspensao }}</w:t>
+      </w:r>
+    </w:p>
+    <w:p ns2:paraId="313F4CEC" ns2:textId="5B357AFF">
       <w:pPr>
         <w:spacing w:before="80" w:after="80"/>
         <w:ind w:left="360"/>
@@ -3711,7 +2961,7 @@
         <w:t>Caso informações, documentos ou classificações fornecidos pela CONTRATANTE se revelem incorretos ou incompletos, ou sejam alterados após o processamento — incluindo cancelamento ou substituição retroativa de notas fiscais, retificação de extratos, reclassificação de lançamentos já validados ou reabertura de competência encerrada — o reprocessamento constitui serviço extraordinário, nos termos da Cláusula 2.3, orçado previamente e tomando por base o mínimo de 30% do honorário mensal vigente por competência reaberta.</w:t>
       </w:r>
     </w:p>
-    <w:p>
+    <w:p ns2:paraId="302ECB93" ns2:textId="6DDF05C2">
       <w:pPr>
         <w:spacing w:before="80" w:after="80"/>
         <w:ind w:left="360"/>
@@ -3758,7 +3008,7 @@
         <w:t xml:space="preserve"> da documentação da respectiva competência.</w:t>
       </w:r>
     </w:p>
-    <w:p>
+    <w:p ns2:paraId="12D99A60" ns2:textId="31E71478">
       <w:pPr>
         <w:spacing w:before="80" w:after="80"/>
         <w:ind w:left="360"/>
@@ -3792,7 +3042,7 @@
         <w:t>Multas, juros e penalidades impostos por órgãos públicos em razão de atraso, omissão, incompletude ou inexatidão de documentos e informações de responsabilidade da CONTRATANTE são de sua responsabilidade exclusiva — inclusive quando a entrega após o prazo da Cláusula 6.2 inviabilizar o cumprimento tempestivo de obrigação pela CONTRATADA. A CONTRATADA comunicará a pendência identificada, mas a comunicação não transfere a responsabilidade pela origem do atraso.</w:t>
       </w:r>
     </w:p>
-    <w:p>
+    <w:p ns2:paraId="6E44E8AA" ns2:textId="77777777">
       <w:pPr>
         <w:pBdr>
           <w:bottom w:val="single" w:sz="6" w:space="4" w:color="E06020"/>
@@ -3814,7 +3064,7 @@
         <w:t>7. RESPONSABILIDADES DA CONTRATANTE</w:t>
       </w:r>
     </w:p>
-    <w:p>
+    <w:p ns2:paraId="649EB140" ns2:textId="77777777">
       <w:pPr>
         <w:spacing w:before="80" w:after="80"/>
         <w:ind w:left="360"/>
@@ -3855,7 +3105,7 @@
         <w:t xml:space="preserve"> e que a empresa está devidamente registrada e opera dentro de seu objeto social.</w:t>
       </w:r>
     </w:p>
-    <w:p>
+    <w:p ns2:paraId="3702C8E1" ns2:textId="77777777">
       <w:pPr>
         <w:spacing w:before="80" w:after="80"/>
         <w:ind w:left="360"/>
@@ -3896,7 +3146,7 @@
         <w:t xml:space="preserve"> operações ilegais que devam impactar as demonstrações contábeis.</w:t>
       </w:r>
     </w:p>
-    <w:p>
+    <w:p ns2:paraId="00E13769" ns2:textId="77777777">
       <w:pPr>
         <w:spacing w:before="80" w:after="80"/>
         <w:ind w:left="360"/>
@@ -3937,7 +3187,7 @@
         <w:t xml:space="preserve"> (art. 7º do Código de Ética do Contador).</w:t>
       </w:r>
     </w:p>
-    <w:p>
+    <w:p ns2:paraId="5B175830" ns2:textId="77777777">
       <w:pPr>
         <w:spacing w:before="80" w:after="80"/>
         <w:ind w:left="360"/>
@@ -3962,7 +3212,7 @@
         <w:t>Multas por atraso em declarações causadas por omissão da CONTRATADA são de responsabilidade desta — exceto se houver parcelas em aberto ou atraso na entrega de documentos pela CONTRATANTE.</w:t>
       </w:r>
     </w:p>
-    <w:p>
+    <w:p ns2:paraId="299F0740" ns2:textId="77777777">
       <w:pPr>
         <w:spacing w:before="80" w:after="80"/>
         <w:ind w:left="360"/>
@@ -4021,7 +3271,7 @@
         <w:t xml:space="preserve"> do profissional nos primeiros 12 meses de contratação.</w:t>
       </w:r>
     </w:p>
-    <w:p>
+    <w:p ns2:paraId="7242DC1D" ns2:textId="77777777">
       <w:pPr>
         <w:spacing w:before="80" w:after="80"/>
         <w:ind w:left="360"/>
@@ -4030,7 +3280,7 @@
         </w:rPr>
       </w:pPr>
     </w:p>
-    <w:p>
+    <w:p ns2:paraId="54E5F113" ns2:textId="77777777">
       <w:pPr>
         <w:pBdr>
           <w:bottom w:val="single" w:sz="6" w:space="4" w:color="E06020"/>
@@ -4052,7 +3302,7 @@
         <w:t>8. FORO</w:t>
       </w:r>
     </w:p>
-    <w:p>
+    <w:p ns2:paraId="145E430B" ns2:textId="7D7B192B">
       <w:pPr>
         <w:spacing w:before="80" w:after="80"/>
         <w:ind w:left="360"/>
@@ -4061,94 +3311,10 @@
         </w:rPr>
       </w:pPr>
       <w:r>
-        <w:rPr>
-          <w:rFonts w:asciiTheme="minorHAnsi" w:hAnsiTheme="minorHAnsi"/>
-          <w:b/>
-          <w:bCs/>
-          <w:color w:val="2E6DA4"/>
-        </w:rPr>
-        <w:t xml:space="preserve">8.1  </w:t>
-      </w:r>
-      <w:r>
-        <w:rPr>
-          <w:rFonts w:asciiTheme="minorHAnsi" w:hAnsiTheme="minorHAnsi"/>
-          <w:color w:val="1A1A1A"/>
-        </w:rPr>
-        <w:t xml:space="preserve">Fica eleito o foro da </w:t>
-      </w:r>
-      <w:r>
-        <w:rPr>
-          <w:rFonts w:asciiTheme="minorHAnsi" w:hAnsiTheme="minorHAnsi"/>
-          <w:b/>
-          <w:bCs/>
-          <w:color w:val="1A1A1A"/>
-        </w:rPr>
-        <w:t xml:space="preserve">Comarca de </w:t>
-      </w:r>
-      <w:r>
-        <w:rPr>
-          <w:rFonts w:asciiTheme="minorHAnsi" w:hAnsiTheme="minorHAnsi"/>
-          <w:b/>
-          <w:bCs/>
-          <w:color w:val="1A1A1A"/>
-        </w:rPr>
-        <w:fldChar w:fldCharType="begin"/>
-      </w:r>
-      <w:r>
-        <w:rPr>
-          <w:rFonts w:asciiTheme="minorHAnsi" w:hAnsiTheme="minorHAnsi"/>
-          <w:b/>
-          <w:bCs/>
-          <w:color w:val="1A1A1A"/>
-        </w:rPr>
-        <w:instrText xml:space="preserve"> MERGEFIELD Foro </w:instrText>
-      </w:r>
-      <w:r>
-        <w:rPr>
-          <w:rFonts w:asciiTheme="minorHAnsi" w:hAnsiTheme="minorHAnsi"/>
-          <w:b/>
-          <w:bCs/>
-          <w:color w:val="1A1A1A"/>
-        </w:rPr>
-        <w:fldChar w:fldCharType="separate"/>
-      </w:r>
-      <w:r>
-        <w:rPr>
-          <w:rFonts w:asciiTheme="minorHAnsi" w:hAnsiTheme="minorHAnsi"/>
-          <w:b/>
-          <w:bCs/>
-          <w:noProof/>
-          <w:color w:val="1A1A1A"/>
-        </w:rPr>
-        <w:t>«Foro»</w:t>
-      </w:r>
-      <w:r>
-        <w:rPr>
-          <w:rFonts w:asciiTheme="minorHAnsi" w:hAnsiTheme="minorHAnsi"/>
-          <w:b/>
-          <w:bCs/>
-          <w:color w:val="1A1A1A"/>
-        </w:rPr>
-        <w:fldChar w:fldCharType="end"/>
-      </w:r>
-      <w:r>
-        <w:rPr>
-          <w:rFonts w:asciiTheme="minorHAnsi" w:hAnsiTheme="minorHAnsi"/>
-          <w:b/>
-          <w:bCs/>
-          <w:color w:val="1A1A1A"/>
-        </w:rPr>
-        <w:t xml:space="preserve"> </w:t>
-      </w:r>
-      <w:r>
-        <w:rPr>
-          <w:rFonts w:asciiTheme="minorHAnsi" w:hAnsiTheme="minorHAnsi"/>
-          <w:color w:val="1A1A1A"/>
-        </w:rPr>
-        <w:t>para dirimir quaisquer litígios decorrentes deste Contrato.</w:t>
-      </w:r>
-    </w:p>
-    <w:p>
+        <w:t xml:space="preserve">{{ texto_clausula_8_1 }}</w:t>
+      </w:r>
+    </w:p>
+    <w:p ns2:paraId="7F3EA800" ns2:textId="77777777">
       <w:pPr>
         <w:spacing w:before="400" w:after="80"/>
         <w:rPr>
@@ -4163,7 +3329,7 @@
         <w:t>As Partes declaram ter lido, entendido e aceito integralmente os termos deste Contrato.</w:t>
       </w:r>
     </w:p>
-    <w:p>
+    <w:p ns2:paraId="21C0123F" ns2:textId="1D23DD1B">
       <w:pPr>
         <w:spacing w:before="200" w:after="40"/>
         <w:jc w:val="center"/>
@@ -4172,25 +3338,10 @@
         </w:rPr>
       </w:pPr>
       <w:r>
-        <w:rPr>
-          <w:rFonts w:asciiTheme="minorHAnsi" w:hAnsiTheme="minorHAnsi"/>
-        </w:rPr>
-        <w:t>Recife/PE</w:t>
-      </w:r>
-      <w:r>
-        <w:rPr>
-          <w:rFonts w:asciiTheme="minorHAnsi" w:hAnsiTheme="minorHAnsi"/>
-        </w:rPr>
-        <w:t xml:space="preserve">, </w:t>
-      </w:r>
-      <w:r>
-        <w:rPr>
-          <w:rFonts w:asciiTheme="minorHAnsi" w:hAnsiTheme="minorHAnsi"/>
-        </w:rPr>
-        <w:t>15/06/2026</w:t>
-      </w:r>
-    </w:p>
-    <w:p>
+        <w:t xml:space="preserve">{{ data_extenso }}</w:t>
+      </w:r>
+    </w:p>
+    <w:p ns2:paraId="6088B34E" ns2:textId="77777777">
       <w:pPr>
         <w:spacing w:before="400"/>
         <w:rPr>
@@ -4219,7 +3370,7 @@
         <w:gridCol w:w="4480"/>
         <w:gridCol w:w="4480"/>
       </w:tblGrid>
-      <w:tr>
+      <w:tr ns2:paraId="54CB56F8" ns2:textId="77777777">
         <w:tc>
           <w:tcPr>
             <w:tcW w:w="4480" w:type="dxa"/>
@@ -4230,7 +3381,7 @@
               <w:right w:val="none" w:sz="0" w:space="0" w:color="FFFFFF"/>
             </w:tcBorders>
           </w:tcPr>
-          <w:p>
+          <w:p ns2:paraId="7753AEEB" ns2:textId="1D2DC611">
             <w:pPr>
               <w:pBdr>
                 <w:top w:val="single" w:sz="4" w:space="0" w:color="999999"/>
@@ -4241,75 +3392,7 @@
               </w:rPr>
             </w:pPr>
             <w:r>
-              <w:rPr>
-                <w:rFonts w:asciiTheme="minorHAnsi" w:hAnsiTheme="minorHAnsi"/>
-                <w:color w:val="1A1A1A"/>
-              </w:rPr>
-              <w:t>Andreia de Oliveira Belaus</w:t>
-            </w:r>
-            <w:r>
-              <w:rPr>
-                <w:rFonts w:asciiTheme="minorHAnsi" w:hAnsiTheme="minorHAnsi"/>
-                <w:sz w:val="21"/>
-                <w:szCs w:val="21"/>
-              </w:rPr>
-              <w:t xml:space="preserve"> </w:t>
-            </w:r>
-            <w:r>
-              <w:rPr>
-                <w:rFonts w:asciiTheme="minorHAnsi" w:hAnsiTheme="minorHAnsi"/>
-                <w:sz w:val="21"/>
-                <w:szCs w:val="21"/>
-              </w:rPr>
-              <w:fldChar w:fldCharType="begin"/>
-            </w:r>
-            <w:r>
-              <w:rPr>
-                <w:rFonts w:asciiTheme="minorHAnsi" w:hAnsiTheme="minorHAnsi"/>
-                <w:sz w:val="21"/>
-                <w:szCs w:val="21"/>
-              </w:rPr>
-              <w:instrText xml:space="preserve"> MERGEFIELD Nome_do_Contratante </w:instrText>
-            </w:r>
-            <w:r>
-              <w:rPr>
-                <w:rFonts w:asciiTheme="minorHAnsi" w:hAnsiTheme="minorHAnsi"/>
-                <w:sz w:val="21"/>
-                <w:szCs w:val="21"/>
-              </w:rPr>
-              <w:fldChar w:fldCharType="separate"/>
-            </w:r>
-            <w:r>
-              <w:rPr>
-                <w:rFonts w:asciiTheme="minorHAnsi" w:hAnsiTheme="minorHAnsi"/>
-                <w:sz w:val="21"/>
-                <w:szCs w:val="21"/>
-              </w:rPr>
-              <w:fldChar w:fldCharType="end"/>
-            </w:r>
-          </w:p>
-          <w:p>
-            <w:pPr>
-              <w:jc w:val="center"/>
-              <w:rPr>
-                <w:rFonts w:asciiTheme="minorHAnsi" w:hAnsiTheme="minorHAnsi"/>
-              </w:rPr>
-            </w:pPr>
-            <w:r>
-              <w:rPr>
-                <w:rFonts w:asciiTheme="minorHAnsi" w:hAnsiTheme="minorHAnsi"/>
-                <w:color w:val="666666"/>
-                <w:sz w:val="20"/>
-                <w:szCs w:val="20"/>
-              </w:rPr>
-              <w:t xml:space="preserve">CONTRATANTE — CPF: </w:t>
-            </w:r>
-            <w:r>
-              <w:rPr>
-                <w:rFonts w:asciiTheme="minorHAnsi" w:hAnsiTheme="minorHAnsi"/>
-                <w:color w:val="1A1A1A"/>
-              </w:rPr>
-              <w:t>021.751.119-89</w:t>
+              <w:t xml:space="preserve">{{ bloco_assinatura_contratantes }}</w:t>
             </w:r>
           </w:p>
         </w:tc>
@@ -4323,7 +3406,7 @@
               <w:right w:val="none" w:sz="0" w:space="0" w:color="FFFFFF"/>
             </w:tcBorders>
           </w:tcPr>
-          <w:p>
+          <w:p ns2:paraId="6D64F8DF" ns2:textId="44258645">
             <w:pPr>
               <w:pBdr>
                 <w:top w:val="single" w:sz="4" w:space="0" w:color="999999"/>
@@ -4334,265 +3417,55 @@
               </w:rPr>
             </w:pPr>
             <w:r>
-              <w:rPr>
-                <w:rFonts w:asciiTheme="minorHAnsi" w:hAnsiTheme="minorHAnsi"/>
-                <w:sz w:val="21"/>
-                <w:szCs w:val="21"/>
-              </w:rPr>
-              <w:t>André Abdom Ximenes Cavalcanti</w:t>
-            </w:r>
-          </w:p>
-          <w:p>
-            <w:pPr>
-              <w:jc w:val="center"/>
-              <w:rPr>
-                <w:rFonts w:asciiTheme="minorHAnsi" w:hAnsiTheme="minorHAnsi"/>
-              </w:rPr>
-            </w:pPr>
-            <w:r>
-              <w:rPr>
-                <w:rFonts w:asciiTheme="minorHAnsi" w:hAnsiTheme="minorHAnsi"/>
-                <w:color w:val="666666"/>
-                <w:sz w:val="20"/>
-                <w:szCs w:val="20"/>
-              </w:rPr>
-              <w:t xml:space="preserve">CONTRATADA — CPF: </w:t>
-            </w:r>
-            <w:r>
-              <w:rPr>
-                <w:rFonts w:asciiTheme="minorHAnsi" w:hAnsiTheme="minorHAnsi"/>
-                <w:color w:val="666666"/>
-                <w:sz w:val="20"/>
-                <w:szCs w:val="20"/>
-              </w:rPr>
-              <w:t>053.594.034-38</w:t>
+              <w:t xml:space="preserve">{{ bloco_assinatura_contratada }}</w:t>
             </w:r>
           </w:p>
         </w:tc>
       </w:tr>
     </w:tbl>
-    <w:p>
-      <w:pPr>
-        <w:rPr>
-          <w:rFonts w:asciiTheme="minorHAnsi" w:hAnsiTheme="minorHAnsi"/>
-        </w:rPr>
-      </w:pPr>
-    </w:p>
-    <w:p>
-      <w:pPr>
-        <w:rPr>
-          <w:rFonts w:asciiTheme="minorHAnsi" w:hAnsiTheme="minorHAnsi"/>
-        </w:rPr>
-      </w:pPr>
-    </w:p>
-    <w:p>
-      <w:pPr>
-        <w:rPr>
-          <w:rFonts w:asciiTheme="minorHAnsi" w:hAnsiTheme="minorHAnsi"/>
-        </w:rPr>
-      </w:pPr>
-    </w:p>
-    <w:p>
-      <w:pPr>
-        <w:rPr>
-          <w:rFonts w:asciiTheme="minorHAnsi" w:hAnsiTheme="minorHAnsi"/>
-        </w:rPr>
-      </w:pPr>
-    </w:p>
-    <w:p>
-      <w:pPr>
-        <w:rPr>
-          <w:rFonts w:asciiTheme="minorHAnsi" w:hAnsiTheme="minorHAnsi"/>
-        </w:rPr>
-      </w:pPr>
-    </w:p>
-    <w:p>
-      <w:pPr>
-        <w:rPr>
-          <w:rFonts w:asciiTheme="minorHAnsi" w:hAnsiTheme="minorHAnsi"/>
-        </w:rPr>
-      </w:pPr>
-    </w:p>
-    <w:tbl>
-      <w:tblPr>
-        <w:tblW w:w="8960" w:type="dxa"/>
-        <w:tblBorders>
-          <w:top w:val="single" w:sz="4" w:space="0" w:color="auto"/>
-          <w:left w:val="single" w:sz="4" w:space="0" w:color="auto"/>
-          <w:bottom w:val="single" w:sz="4" w:space="0" w:color="auto"/>
-          <w:right w:val="single" w:sz="4" w:space="0" w:color="auto"/>
-          <w:insideH w:val="single" w:sz="4" w:space="0" w:color="auto"/>
-          <w:insideV w:val="single" w:sz="4" w:space="0" w:color="auto"/>
-        </w:tblBorders>
-        <w:tblCellMar>
-          <w:left w:w="10" w:type="dxa"/>
-          <w:right w:w="10" w:type="dxa"/>
-        </w:tblCellMar>
-        <w:tblLook w:val="04A0" w:firstRow="1" w:lastRow="0" w:firstColumn="1" w:lastColumn="0" w:noHBand="0" w:noVBand="1"/>
-      </w:tblPr>
-      <w:tblGrid>
-        <w:gridCol w:w="4480"/>
-        <w:gridCol w:w="4480"/>
-      </w:tblGrid>
-      <w:tr>
-        <w:tc>
-          <w:tcPr>
-            <w:tcW w:w="4480" w:type="dxa"/>
-            <w:tcBorders>
-              <w:top w:val="none" w:sz="0" w:space="0" w:color="FFFFFF"/>
-              <w:left w:val="none" w:sz="0" w:space="0" w:color="FFFFFF"/>
-              <w:bottom w:val="none" w:sz="0" w:space="0" w:color="FFFFFF"/>
-              <w:right w:val="none" w:sz="0" w:space="0" w:color="FFFFFF"/>
-            </w:tcBorders>
-          </w:tcPr>
-          <w:p>
-            <w:pPr>
-              <w:pBdr>
-                <w:top w:val="single" w:sz="4" w:space="0" w:color="999999"/>
-              </w:pBdr>
-              <w:jc w:val="center"/>
-              <w:rPr>
-                <w:rFonts w:asciiTheme="minorHAnsi" w:hAnsiTheme="minorHAnsi"/>
-              </w:rPr>
-            </w:pPr>
-            <w:r>
-              <w:rPr>
-                <w:rFonts w:asciiTheme="minorHAnsi" w:hAnsiTheme="minorHAnsi"/>
-                <w:color w:val="1A1A1A"/>
-              </w:rPr>
-              <w:t>Hugo Altevir Costa Lima</w:t>
-            </w:r>
-            <w:r>
-              <w:rPr>
-                <w:rFonts w:asciiTheme="minorHAnsi" w:hAnsiTheme="minorHAnsi"/>
-                <w:sz w:val="21"/>
-                <w:szCs w:val="21"/>
-              </w:rPr>
-              <w:fldChar w:fldCharType="begin"/>
-            </w:r>
-            <w:r>
-              <w:rPr>
-                <w:rFonts w:asciiTheme="minorHAnsi" w:hAnsiTheme="minorHAnsi"/>
-                <w:sz w:val="21"/>
-                <w:szCs w:val="21"/>
-              </w:rPr>
-              <w:instrText xml:space="preserve"> MERGEFIELD Nome_do_Contratante </w:instrText>
-            </w:r>
-            <w:r>
-              <w:rPr>
-                <w:rFonts w:asciiTheme="minorHAnsi" w:hAnsiTheme="minorHAnsi"/>
-                <w:sz w:val="21"/>
-                <w:szCs w:val="21"/>
-              </w:rPr>
-              <w:fldChar w:fldCharType="separate"/>
-            </w:r>
-            <w:r>
-              <w:rPr>
-                <w:rFonts w:asciiTheme="minorHAnsi" w:hAnsiTheme="minorHAnsi"/>
-                <w:sz w:val="21"/>
-                <w:szCs w:val="21"/>
-              </w:rPr>
-              <w:fldChar w:fldCharType="end"/>
-            </w:r>
-          </w:p>
-          <w:p>
-            <w:pPr>
-              <w:jc w:val="center"/>
-              <w:rPr>
-                <w:rFonts w:asciiTheme="minorHAnsi" w:hAnsiTheme="minorHAnsi"/>
-              </w:rPr>
-            </w:pPr>
-            <w:r>
-              <w:rPr>
-                <w:rFonts w:asciiTheme="minorHAnsi" w:hAnsiTheme="minorHAnsi"/>
-                <w:color w:val="666666"/>
-                <w:sz w:val="20"/>
-                <w:szCs w:val="20"/>
-              </w:rPr>
-              <w:t xml:space="preserve">CONTRATANTE — CPF: </w:t>
-            </w:r>
-            <w:r>
-              <w:rPr>
-                <w:rFonts w:asciiTheme="minorHAnsi" w:hAnsiTheme="minorHAnsi"/>
-                <w:color w:val="1A1A1A"/>
-              </w:rPr>
-              <w:t>382.321.119-68</w:t>
-            </w:r>
-          </w:p>
-        </w:tc>
-        <w:tc>
-          <w:tcPr>
-            <w:tcW w:w="4480" w:type="dxa"/>
-            <w:tcBorders>
-              <w:top w:val="none" w:sz="0" w:space="0" w:color="FFFFFF"/>
-              <w:left w:val="none" w:sz="0" w:space="0" w:color="FFFFFF"/>
-              <w:bottom w:val="none" w:sz="0" w:space="0" w:color="FFFFFF"/>
-              <w:right w:val="none" w:sz="0" w:space="0" w:color="FFFFFF"/>
-            </w:tcBorders>
-          </w:tcPr>
-          <w:p>
-            <w:pPr>
-              <w:pBdr>
-                <w:top w:val="single" w:sz="4" w:space="0" w:color="999999"/>
-              </w:pBdr>
-              <w:jc w:val="center"/>
-              <w:rPr>
-                <w:rFonts w:asciiTheme="minorHAnsi" w:hAnsiTheme="minorHAnsi"/>
-              </w:rPr>
-            </w:pPr>
-            <w:r>
-              <w:rPr>
-                <w:rFonts w:asciiTheme="minorHAnsi" w:hAnsiTheme="minorHAnsi"/>
-                <w:sz w:val="21"/>
-                <w:szCs w:val="21"/>
-              </w:rPr>
-              <w:t>Bruna Costa Lima</w:t>
-            </w:r>
-          </w:p>
-          <w:p>
-            <w:pPr>
-              <w:jc w:val="center"/>
-              <w:rPr>
-                <w:rFonts w:asciiTheme="minorHAnsi" w:hAnsiTheme="minorHAnsi"/>
-              </w:rPr>
-            </w:pPr>
-            <w:r>
-              <w:rPr>
-                <w:rFonts w:asciiTheme="minorHAnsi" w:hAnsiTheme="minorHAnsi"/>
-                <w:color w:val="666666"/>
-                <w:sz w:val="20"/>
-                <w:szCs w:val="20"/>
-              </w:rPr>
-              <w:t>CONTRATANTE — CPF</w:t>
-            </w:r>
-            <w:r>
-              <w:rPr>
-                <w:rFonts w:asciiTheme="minorHAnsi" w:hAnsiTheme="minorHAnsi"/>
-                <w:color w:val="666666"/>
-                <w:sz w:val="20"/>
-                <w:szCs w:val="20"/>
-              </w:rPr>
-              <w:t>:</w:t>
-            </w:r>
-            <w:r>
-              <w:rPr>
-                <w:rFonts w:asciiTheme="minorHAnsi" w:hAnsiTheme="minorHAnsi"/>
-                <w:color w:val="1A1A1A"/>
-              </w:rPr>
-              <w:t xml:space="preserve"> </w:t>
-            </w:r>
-            <w:r>
-              <w:rPr>
-                <w:rFonts w:asciiTheme="minorHAnsi" w:hAnsiTheme="minorHAnsi"/>
-                <w:color w:val="1A1A1A"/>
-              </w:rPr>
-              <w:t>104.932.889-29</w:t>
-            </w:r>
-          </w:p>
-        </w:tc>
-      </w:tr>
-    </w:tbl>
-    <w:p>
+    <w:p ns2:paraId="64F10D05" ns2:textId="77777777">
+      <w:pPr>
+        <w:rPr>
+          <w:rFonts w:asciiTheme="minorHAnsi" w:hAnsiTheme="minorHAnsi"/>
+        </w:rPr>
+      </w:pPr>
+    </w:p>
+    <w:p ns2:paraId="637FB0F6" ns2:textId="77777777">
+      <w:pPr>
+        <w:rPr>
+          <w:rFonts w:asciiTheme="minorHAnsi" w:hAnsiTheme="minorHAnsi"/>
+        </w:rPr>
+      </w:pPr>
+    </w:p>
+    <w:p ns2:paraId="15762047" ns2:textId="77777777">
+      <w:pPr>
+        <w:rPr>
+          <w:rFonts w:asciiTheme="minorHAnsi" w:hAnsiTheme="minorHAnsi"/>
+        </w:rPr>
+      </w:pPr>
+    </w:p>
+    <w:p ns2:paraId="593F7F36" ns2:textId="77777777">
+      <w:pPr>
+        <w:rPr>
+          <w:rFonts w:asciiTheme="minorHAnsi" w:hAnsiTheme="minorHAnsi"/>
+        </w:rPr>
+      </w:pPr>
+    </w:p>
+    <w:p ns2:paraId="4370CEEA" ns2:textId="77777777">
+      <w:pPr>
+        <w:rPr>
+          <w:rFonts w:asciiTheme="minorHAnsi" w:hAnsiTheme="minorHAnsi"/>
+        </w:rPr>
+      </w:pPr>
+    </w:p>
+    <w:p ns2:paraId="07C501D1" ns2:textId="77777777">
+      <w:pPr>
+        <w:rPr>
+          <w:rFonts w:asciiTheme="minorHAnsi" w:hAnsiTheme="minorHAnsi"/>
+        </w:rPr>
+      </w:pPr>
+    </w:p>
+    <w:p ns2:paraId="17D43978" ns2:textId="59BECCD6">
       <w:pPr>
         <w:rPr>
           <w:rFonts w:asciiTheme="minorHAnsi" w:hAnsiTheme="minorHAnsi"/>
@@ -4605,7 +3478,7 @@
         <w:br w:type="page"/>
       </w:r>
     </w:p>
-    <w:p>
+    <w:p ns2:paraId="43AD6E1C" ns2:textId="77777777">
       <w:pPr>
         <w:spacing w:after="200"/>
         <w:rPr>
@@ -4625,7 +3498,7 @@
         <w:t>ANEXO I — PARÂMETROS DE REAJUSTE DE HONORÁRIOS</w:t>
       </w:r>
     </w:p>
-    <w:p>
+    <w:p ns2:paraId="6F6606E1" ns2:textId="77777777">
       <w:pPr>
         <w:spacing w:before="80" w:after="80"/>
         <w:ind w:left="360"/>
@@ -4650,7 +3523,7 @@
         <w:t>Quantidade de funcionários (novas filiais ou aumento significativo);</w:t>
       </w:r>
     </w:p>
-    <w:p>
+    <w:p ns2:paraId="3822D65B" ns2:textId="77777777">
       <w:pPr>
         <w:spacing w:before="80" w:after="80"/>
         <w:ind w:left="360"/>
@@ -4675,7 +3548,7 @@
         <w:t>Volume de notas fiscais por mês (entradas, saídas e serviços);</w:t>
       </w:r>
     </w:p>
-    <w:p>
+    <w:p ns2:paraId="2B863B33" ns2:textId="77777777">
       <w:pPr>
         <w:spacing w:before="80" w:after="80"/>
         <w:ind w:left="360"/>
@@ -4700,7 +3573,7 @@
         <w:t>Quantidade de lançamentos contábeis mensais;</w:t>
       </w:r>
     </w:p>
-    <w:p>
+    <w:p ns2:paraId="5799DAB5" ns2:textId="77777777">
       <w:pPr>
         <w:spacing w:before="80" w:after="80"/>
         <w:ind w:left="360"/>
@@ -4725,7 +3598,7 @@
         <w:t>Aumento de faturamento (incremento de responsabilidade tributária);</w:t>
       </w:r>
     </w:p>
-    <w:p>
+    <w:p ns2:paraId="44684106" ns2:textId="19CFF68A">
       <w:pPr>
         <w:spacing w:before="80" w:after="80"/>
         <w:ind w:left="360"/>

</xml_diff>

<commit_message>
Atualiza contrato VCA 2026 com numeração separada e novas cláusulas.
Separa número e corpo das cláusulas no Word/preview, expande textos de serviços
no seed e regenera o template a partir do modelo 2026.

Co-authored-by: Cursor <cursoragent@cursor.com>
</commit_message>
<xml_diff>
--- a/app/templates_docx/contrato_modelo.docx
+++ b/app/templates_docx/contrato_modelo.docx
@@ -74,11 +74,8 @@
       <w:r>
         <w:rPr>
           <w:rFonts w:asciiTheme="minorHAnsi" w:hAnsiTheme="minorHAnsi"/>
-          <w:color w:val="666666"/>
-          <w:sz w:val="26"/>
-          <w:szCs w:val="26"/>
-        </w:rPr>
-        <w:t>CPSA-VCA-2026</w:t>
+        </w:rPr>
+        <w:t>CPSA-2026</w:t>
       </w:r>
     </w:p>
     <w:p ns2:paraId="373074B8" ns2:textId="77777777">
@@ -210,6 +207,9 @@
               </w:rPr>
             </w:pPr>
             <w:r>
+              <w:rPr>
+                <w:rFonts w:asciiTheme="minorHAnsi" w:hAnsiTheme="minorHAnsi"/>
+              </w:rPr>
               <w:t xml:space="preserve">{{ tipo_servico }}</w:t>
             </w:r>
           </w:p>
@@ -276,6 +276,9 @@
               </w:rPr>
             </w:pPr>
             <w:r>
+              <w:rPr>
+                <w:rFonts w:asciiTheme="minorHAnsi" w:hAnsiTheme="minorHAnsi"/>
+              </w:rPr>
               <w:t xml:space="preserve">{{ empresa_contratada }}</w:t>
             </w:r>
           </w:p>
@@ -353,6 +356,9 @@
               </w:rPr>
             </w:pPr>
             <w:r>
+              <w:rPr>
+                <w:rFonts w:asciiTheme="minorHAnsi" w:hAnsiTheme="minorHAnsi"/>
+              </w:rPr>
               <w:t xml:space="preserve">{{ inicio_vigencia_formatada }} e {{ texto_vigencia }}</w:t>
             </w:r>
           </w:p>
@@ -419,6 +425,9 @@
               </w:rPr>
             </w:pPr>
             <w:r>
+              <w:rPr>
+                <w:rFonts w:asciiTheme="minorHAnsi" w:hAnsiTheme="minorHAnsi"/>
+              </w:rPr>
               <w:t xml:space="preserve">{{ texto_forma_pagamento }}</w:t>
             </w:r>
           </w:p>
@@ -485,6 +494,9 @@
               </w:rPr>
             </w:pPr>
             <w:r>
+              <w:rPr>
+                <w:rFonts w:asciiTheme="minorHAnsi" w:hAnsiTheme="minorHAnsi"/>
+              </w:rPr>
               <w:t xml:space="preserve">{{ texto_reajuste }}</w:t>
             </w:r>
           </w:p>
@@ -551,6 +563,9 @@
               </w:rPr>
             </w:pPr>
             <w:r>
+              <w:rPr>
+                <w:rFonts w:asciiTheme="minorHAnsi" w:hAnsiTheme="minorHAnsi"/>
+              </w:rPr>
               <w:t xml:space="preserve">{{ label_decima_terceira_parcela }}</w:t>
             </w:r>
           </w:p>
@@ -617,6 +632,9 @@
               </w:rPr>
             </w:pPr>
             <w:r>
+              <w:rPr>
+                <w:rFonts w:asciiTheme="minorHAnsi" w:hAnsiTheme="minorHAnsi"/>
+              </w:rPr>
               <w:t xml:space="preserve">{{ label_rescisao }}</w:t>
             </w:r>
           </w:p>
@@ -683,6 +701,9 @@
               </w:rPr>
             </w:pPr>
             <w:r>
+              <w:rPr>
+                <w:rFonts w:asciiTheme="minorHAnsi" w:hAnsiTheme="minorHAnsi"/>
+              </w:rPr>
               <w:t xml:space="preserve">{{ label_suspensao }}</w:t>
             </w:r>
           </w:p>
@@ -749,6 +770,9 @@
               </w:rPr>
             </w:pPr>
             <w:r>
+              <w:rPr>
+                <w:rFonts w:asciiTheme="minorHAnsi" w:hAnsiTheme="minorHAnsi"/>
+              </w:rPr>
               <w:t xml:space="preserve">{{ texto_foro }}</w:t>
             </w:r>
           </w:p>
@@ -1003,6 +1027,9 @@
               </w:rPr>
             </w:pPr>
             <w:r>
+              <w:rPr>
+                <w:rFonts w:asciiTheme="minorHAnsi" w:hAnsiTheme="minorHAnsi"/>
+              </w:rPr>
               <w:t xml:space="preserve">{{ cnpj }}</w:t>
             </w:r>
           </w:p>
@@ -1032,6 +1059,9 @@
               </w:rPr>
             </w:pPr>
             <w:r>
+              <w:rPr>
+                <w:rFonts w:asciiTheme="minorHAnsi" w:hAnsiTheme="minorHAnsi"/>
+              </w:rPr>
               <w:t xml:space="preserve">{{ enquadramento }}</w:t>
             </w:r>
           </w:p>
@@ -1061,6 +1091,9 @@
               </w:rPr>
             </w:pPr>
             <w:r>
+              <w:rPr>
+                <w:rFonts w:asciiTheme="minorHAnsi" w:hAnsiTheme="minorHAnsi"/>
+              </w:rPr>
               <w:t xml:space="preserve">{{ razao_social }}</w:t>
             </w:r>
           </w:p>
@@ -1090,6 +1123,9 @@
               </w:rPr>
             </w:pPr>
             <w:r>
+              <w:rPr>
+                <w:rFonts w:asciiTheme="minorHAnsi" w:hAnsiTheme="minorHAnsi"/>
+              </w:rPr>
               <w:t xml:space="preserve">{{ valor_mensal_formatado }}</w:t>
             </w:r>
           </w:p>
@@ -1104,6 +1140,9 @@
         </w:rPr>
       </w:pPr>
       <w:r>
+        <w:rPr>
+          <w:rFonts w:asciiTheme="minorHAnsi" w:hAnsiTheme="minorHAnsi"/>
+        </w:rPr>
         <w:t xml:space="preserve">{{ texto_partes }}</w:t>
       </w:r>
     </w:p>
@@ -1226,6 +1265,9 @@
         </w:rPr>
       </w:pPr>
       <w:r>
+        <w:rPr>
+          <w:rFonts w:asciiTheme="minorHAnsi" w:hAnsiTheme="minorHAnsi"/>
+        </w:rPr>
         <w:t xml:space="preserve">{{ texto_regime_tributario }}</w:t>
       </w:r>
     </w:p>
@@ -1247,6 +1289,19 @@
         </w:rPr>
       </w:pPr>
       <w:r>
+        <w:rPr>
+          <w:rFonts w:asciiTheme="minorHAnsi" w:hAnsiTheme="minorHAnsi"/>
+          <w:b/>
+          <w:bCs/>
+          <w:color w:val="2E6DA4"/>
+        </w:rPr>
+        <w:t xml:space="preserve">2.2  </w:t>
+      </w:r>
+      <w:r>
+        <w:rPr>
+          <w:rFonts w:asciiTheme="minorHAnsi" w:hAnsiTheme="minorHAnsi"/>
+          <w:color w:val="1A1A1A"/>
+        </w:rPr>
         <w:t xml:space="preserve">{{ texto_detalhamento_servico }}</w:t>
       </w:r>
     </w:p>
@@ -1707,6 +1762,19 @@
         </w:rPr>
       </w:pPr>
       <w:r>
+        <w:rPr>
+          <w:rFonts w:asciiTheme="minorHAnsi" w:hAnsiTheme="minorHAnsi"/>
+          <w:b/>
+          <w:bCs/>
+          <w:color w:val="2E6DA4"/>
+        </w:rPr>
+        <w:t xml:space="preserve">3.1  </w:t>
+      </w:r>
+      <w:r>
+        <w:rPr>
+          <w:rFonts w:asciiTheme="minorHAnsi" w:hAnsiTheme="minorHAnsi"/>
+          <w:color w:val="1A1A1A"/>
+        </w:rPr>
         <w:t xml:space="preserve">{{ texto_vigencia_clausula }}</w:t>
       </w:r>
     </w:p>
@@ -1767,32 +1835,14 @@
           <w:bCs/>
           <w:color w:val="2E6DA4"/>
         </w:rPr>
-        <w:t>3.</w:t>
-      </w:r>
-      <w:r>
-        <w:rPr>
-          <w:rFonts w:asciiTheme="minorHAnsi" w:hAnsiTheme="minorHAnsi"/>
-          <w:b/>
-          <w:bCs/>
-          <w:color w:val="2E6DA4"/>
-        </w:rPr>
-        <w:t>3</w:t>
-      </w:r>
-      <w:r>
-        <w:rPr>
-          <w:rFonts w:asciiTheme="minorHAnsi" w:hAnsiTheme="minorHAnsi"/>
-          <w:b/>
-          <w:bCs/>
-          <w:color w:val="2E6DA4"/>
-        </w:rPr>
-        <w:t xml:space="preserve">  </w:t>
-      </w:r>
-      <w:r>
-        <w:rPr>
-          <w:rFonts w:asciiTheme="minorHAnsi" w:hAnsiTheme="minorHAnsi"/>
-          <w:color w:val="1A1A1A"/>
-        </w:rPr>
-        <w:t>Qualquer das Partes poderá rescindir este Contrato de imediato, sem aviso prévio e sem a multa da Cláusula 3.2, em caso de: (i) inadimplência superior a [90] dias; (ii) fraude, falsidade documental ou recusa da CONTRATANTE em regularizar operações em desacordo com a lei; (iii) descumprimento grave de obrigação contratual não sanado em [15] dias após notificação escrita.</w:t>
+        <w:t xml:space="preserve">3.3  </w:t>
+      </w:r>
+      <w:r>
+        <w:rPr>
+          <w:rFonts w:asciiTheme="minorHAnsi" w:hAnsiTheme="minorHAnsi"/>
+          <w:color w:val="1A1A1A"/>
+        </w:rPr>
+        <w:t>Qualquer das Partes poderá rescindir este Contrato de imediato, sem aviso prévio e sem a multa da Cláusula 3.2, em caso de: (i) inadimplência superior a 90 (noventa) dias; (ii) fraude, falsidade documental ou recusa da CONTRATANTE em regularizar operações em desacordo com a lei; (iii) descumprimento grave de obrigação contratual não sanado em 15 (quinze) dias após notificação escrita.</w:t>
       </w:r>
     </w:p>
     <w:p ns2:paraId="7BCA99AD" ns2:textId="1B54FE83">
@@ -1840,6 +1890,19 @@
         </w:rPr>
       </w:pPr>
       <w:r>
+        <w:rPr>
+          <w:rFonts w:asciiTheme="minorHAnsi" w:hAnsiTheme="minorHAnsi"/>
+          <w:b/>
+          <w:bCs/>
+          <w:color w:val="2E6DA4"/>
+        </w:rPr>
+        <w:t xml:space="preserve">4.1  </w:t>
+      </w:r>
+      <w:r>
+        <w:rPr>
+          <w:rFonts w:asciiTheme="minorHAnsi" w:hAnsiTheme="minorHAnsi"/>
+          <w:color w:val="1A1A1A"/>
+        </w:rPr>
         <w:t xml:space="preserve">{{ texto_clausula_4_1 }}</w:t>
       </w:r>
     </w:p>
@@ -1852,6 +1915,19 @@
         </w:rPr>
       </w:pPr>
       <w:r>
+        <w:rPr>
+          <w:rFonts w:asciiTheme="minorHAnsi" w:hAnsiTheme="minorHAnsi"/>
+          <w:b/>
+          <w:bCs/>
+          <w:color w:val="2E6DA4"/>
+        </w:rPr>
+        <w:t xml:space="preserve">4.2  </w:t>
+      </w:r>
+      <w:r>
+        <w:rPr>
+          <w:rFonts w:asciiTheme="minorHAnsi" w:hAnsiTheme="minorHAnsi"/>
+          <w:color w:val="1A1A1A"/>
+        </w:rPr>
         <w:t xml:space="preserve">{{ texto_clausula_4_2 }}</w:t>
       </w:r>
     </w:p>
@@ -2003,7 +2079,20 @@
         </w:rPr>
       </w:pPr>
       <w:r>
-        <w:t xml:space="preserve">{% if exibir_clausula_decima_terceira %}{{ texto_decima_terceira_parcela }}{% endif %}</w:t>
+        <w:rPr>
+          <w:rFonts w:asciiTheme="minorHAnsi" w:hAnsiTheme="minorHAnsi"/>
+          <w:b/>
+          <w:bCs/>
+          <w:color w:val="2E6DA4"/>
+        </w:rPr>
+        <w:t xml:space="preserve">{% if exibir_clausula_decima_terceira %}4.6  </w:t>
+      </w:r>
+      <w:r>
+        <w:rPr>
+          <w:rFonts w:asciiTheme="minorHAnsi" w:hAnsiTheme="minorHAnsi"/>
+          <w:color w:val="1A1A1A"/>
+        </w:rPr>
+        <w:t xml:space="preserve">{{ texto_decima_terceira_parcela }}{% endif %}</w:t>
       </w:r>
     </w:p>
     <w:p ns2:paraId="54D79507" ns2:textId="77777777">
@@ -2916,6 +3005,19 @@
         </w:rPr>
       </w:pPr>
       <w:r>
+        <w:rPr>
+          <w:rFonts w:asciiTheme="minorHAnsi" w:hAnsiTheme="minorHAnsi"/>
+          <w:b/>
+          <w:bCs/>
+          <w:color w:val="2E6DA4"/>
+        </w:rPr>
+        <w:t xml:space="preserve">6.9  </w:t>
+      </w:r>
+      <w:r>
+        <w:rPr>
+          <w:rFonts w:asciiTheme="minorHAnsi" w:hAnsiTheme="minorHAnsi"/>
+          <w:color w:val="1A1A1A"/>
+        </w:rPr>
         <w:t xml:space="preserve">{{ texto_suspensao }}</w:t>
       </w:r>
     </w:p>
@@ -3311,6 +3413,19 @@
         </w:rPr>
       </w:pPr>
       <w:r>
+        <w:rPr>
+          <w:rFonts w:asciiTheme="minorHAnsi" w:hAnsiTheme="minorHAnsi"/>
+          <w:b/>
+          <w:bCs/>
+          <w:color w:val="2E6DA4"/>
+        </w:rPr>
+        <w:t xml:space="preserve">8.1  </w:t>
+      </w:r>
+      <w:r>
+        <w:rPr>
+          <w:rFonts w:asciiTheme="minorHAnsi" w:hAnsiTheme="minorHAnsi"/>
+          <w:color w:val="1A1A1A"/>
+        </w:rPr>
         <w:t xml:space="preserve">{{ texto_clausula_8_1 }}</w:t>
       </w:r>
     </w:p>
@@ -3338,6 +3453,9 @@
         </w:rPr>
       </w:pPr>
       <w:r>
+        <w:rPr>
+          <w:rFonts w:asciiTheme="minorHAnsi" w:hAnsiTheme="minorHAnsi"/>
+        </w:rPr>
         <w:t xml:space="preserve">{{ data_extenso }}</w:t>
       </w:r>
     </w:p>
@@ -3392,6 +3510,9 @@
               </w:rPr>
             </w:pPr>
             <w:r>
+              <w:rPr>
+                <w:rFonts w:asciiTheme="minorHAnsi" w:hAnsiTheme="minorHAnsi"/>
+              </w:rPr>
               <w:t xml:space="preserve">{{ bloco_assinatura_contratantes }}</w:t>
             </w:r>
           </w:p>
@@ -3417,6 +3538,9 @@
               </w:rPr>
             </w:pPr>
             <w:r>
+              <w:rPr>
+                <w:rFonts w:asciiTheme="minorHAnsi" w:hAnsiTheme="minorHAnsi"/>
+              </w:rPr>
               <w:t xml:space="preserve">{{ bloco_assinatura_contratada }}</w:t>
             </w:r>
           </w:p>

</xml_diff>